<commit_message>
Add inline tables, figures, and supplementary material to manuscript
- Embedded all 7 tables directly in Results section (Markdown format)
- Added all 9 figures inline with captions
- Expanded supplementary appendix with Table S1-S3 and Figure S1-S2
- Added state-level variation section with heatmap (Figure 6)
- Added education gradient figure (Figure 7)

Co-Authored-By: Claude Opus 4.6 (1M context) <noreply@anthropic.com>
</commit_message>
<xml_diff>
--- a/manuscript_lancet.docx
+++ b/manuscript_lancet.docx
@@ -2,7 +2,7 @@
 <file path=word/document.xml><?xml version="1.0" encoding="utf-8"?>
 <w:document xmlns:w="http://schemas.openxmlformats.org/wordprocessingml/2006/main" xmlns:m="http://schemas.openxmlformats.org/officeDocument/2006/math" xmlns:r="http://schemas.openxmlformats.org/officeDocument/2006/relationships" xmlns:o="urn:schemas-microsoft-com:office:office" xmlns:v="urn:schemas-microsoft-com:vml" xmlns:w10="urn:schemas-microsoft-com:office:word" xmlns:a="http://schemas.openxmlformats.org/drawingml/2006/main" xmlns:pic="http://schemas.openxmlformats.org/drawingml/2006/picture" xmlns:wp="http://schemas.openxmlformats.org/drawingml/2006/wordprocessingDrawing">
   <w:body>
-    <w:bookmarkStart w:id="49" w:name="X4b82468bd910541af1a10d7ba0d49f5a99b045d"/>
+    <w:bookmarkStart w:id="67" w:name="X4b82468bd910541af1a10d7ba0d49f5a99b045d"/>
     <w:p>
       <w:pPr>
         <w:pStyle w:val="Heading1"/>
@@ -864,7 +864,7 @@
     </w:p>
     <w:bookmarkEnd w:id="31"/>
     <w:bookmarkEnd w:id="32"/>
-    <w:bookmarkStart w:id="40" w:name="results"/>
+    <w:bookmarkStart w:id="51" w:name="results"/>
     <w:p>
       <w:pPr>
         <w:pStyle w:val="Heading2"/>
@@ -873,7 +873,7 @@
         <w:t xml:space="preserve">Results</w:t>
       </w:r>
     </w:p>
-    <w:bookmarkStart w:id="33" w:name="overall-trends"/>
+    <w:bookmarkStart w:id="34" w:name="overall-trends"/>
     <w:p>
       <w:pPr>
         <w:pStyle w:val="Heading3"/>
@@ -887,7 +887,7 @@
         <w:pStyle w:val="FirstParagraph"/>
       </w:pPr>
       <w:r>
-        <w:t xml:space="preserve">Between 2000 and 2023, Brazil recorded approximately 40 000 maternal deaths among over 72 million livebirths (table 1). The national MMR declined from 73·3 per 100 000 livebirths in 2000 to approximately 52·4 in 2012, representing a 28·5% reduction over 12 years. Between 2012 and 2019, the MMR plateaued at around 55 per 100 000 livebirths. In 2020, the MMR rose sharply to 74·7, reaching a peak of 107·5 in 2021—the highest value recorded in the study period. By 2022, the MMR had returned to 56·0, and preliminary data for 2023 suggest further stabilisation (figure 1).</w:t>
+        <w:t xml:space="preserve">Between 2000 and 2023, Brazil recorded approximately 40 000 maternal deaths among over 72 million livebirths. The national MMR declined from 73·3 per 100 000 livebirths in 2000 to approximately 52·4 in 2012, representing a 28·5% reduction over 12 years. Between 2012 and 2019, the MMR plateaued at around 55 per 100 000 livebirths. In 2020, the MMR rose sharply to 74·7, reaching a peak of 107·5 in 2021—the highest value recorded in the study period. By 2022, the MMR had returned to 56·0, and preliminary data for 2023 suggest further stabilisation (figure 1).</w:t>
       </w:r>
     </w:p>
     <w:p>
@@ -895,6 +895,664 @@
         <w:pStyle w:val="BodyText"/>
       </w:pPr>
       <w:r>
+        <w:rPr>
+          <w:bCs/>
+          <w:b/>
+        </w:rPr>
+        <w:t xml:space="preserve">Table 1. Descriptive characteristics of maternal mortality by period, Brazil, 2000–2023</w:t>
+      </w:r>
+    </w:p>
+    <w:tbl>
+      <w:tblPr>
+        <w:tblStyle w:val="Table"/>
+        <w:tblW w:type="pct" w:w="5000.0"/>
+        <w:tblLook w:firstRow="1" w:lastRow="0" w:firstColumn="0" w:lastColumn="0" w:noHBand="0" w:noVBand="0" w:val="0020"/>
+      </w:tblPr>
+      <w:tblGrid>
+        <w:gridCol w:w="653"/>
+        <w:gridCol w:w="571"/>
+        <w:gridCol w:w="816"/>
+        <w:gridCol w:w="326"/>
+        <w:gridCol w:w="408"/>
+        <w:gridCol w:w="408"/>
+        <w:gridCol w:w="1551"/>
+        <w:gridCol w:w="1224"/>
+        <w:gridCol w:w="1551"/>
+        <w:gridCol w:w="408"/>
+      </w:tblGrid>
+      <w:tr>
+        <w:tc>
+          <w:p>
+            <w:pPr>
+              <w:pStyle w:val="Compact"/>
+              <w:jc w:val="left"/>
+            </w:pPr>
+            <w:r>
+              <w:t xml:space="preserve">Period</w:t>
+            </w:r>
+          </w:p>
+        </w:tc>
+        <w:tc>
+          <w:p>
+            <w:pPr>
+              <w:pStyle w:val="Compact"/>
+              <w:jc w:val="left"/>
+            </w:pPr>
+            <w:r>
+              <w:t xml:space="preserve">Years</w:t>
+            </w:r>
+          </w:p>
+        </w:tc>
+        <w:tc>
+          <w:p>
+            <w:pPr>
+              <w:pStyle w:val="Compact"/>
+              <w:jc w:val="left"/>
+            </w:pPr>
+            <w:r>
+              <w:t xml:space="preserve">MMR Mean</w:t>
+            </w:r>
+          </w:p>
+        </w:tc>
+        <w:tc>
+          <w:p>
+            <w:pPr>
+              <w:pStyle w:val="Compact"/>
+              <w:jc w:val="left"/>
+            </w:pPr>
+            <w:r>
+              <w:t xml:space="preserve">SD</w:t>
+            </w:r>
+          </w:p>
+        </w:tc>
+        <w:tc>
+          <w:p>
+            <w:pPr>
+              <w:pStyle w:val="Compact"/>
+              <w:jc w:val="left"/>
+            </w:pPr>
+            <w:r>
+              <w:t xml:space="preserve">Min</w:t>
+            </w:r>
+          </w:p>
+        </w:tc>
+        <w:tc>
+          <w:p>
+            <w:pPr>
+              <w:pStyle w:val="Compact"/>
+              <w:jc w:val="left"/>
+            </w:pPr>
+            <w:r>
+              <w:t xml:space="preserve">Max</w:t>
+            </w:r>
+          </w:p>
+        </w:tc>
+        <w:tc>
+          <w:p>
+            <w:pPr>
+              <w:pStyle w:val="Compact"/>
+              <w:jc w:val="left"/>
+            </w:pPr>
+            <w:r>
+              <w:t xml:space="preserve">Antenatal ≥7 (%)</w:t>
+            </w:r>
+          </w:p>
+        </w:tc>
+        <w:tc>
+          <w:p>
+            <w:pPr>
+              <w:pStyle w:val="Compact"/>
+              <w:jc w:val="left"/>
+            </w:pPr>
+            <w:r>
+              <w:t xml:space="preserve">C-section (%)</w:t>
+            </w:r>
+          </w:p>
+        </w:tc>
+        <w:tc>
+          <w:p>
+            <w:pPr>
+              <w:pStyle w:val="Compact"/>
+              <w:jc w:val="left"/>
+            </w:pPr>
+            <w:r>
+              <w:t xml:space="preserve">FHS coverage (%)</w:t>
+            </w:r>
+          </w:p>
+        </w:tc>
+        <w:tc>
+          <w:p>
+            <w:pPr>
+              <w:pStyle w:val="Compact"/>
+              <w:jc w:val="left"/>
+            </w:pPr>
+            <w:r>
+              <w:t xml:space="preserve">HDI</w:t>
+            </w:r>
+          </w:p>
+        </w:tc>
+      </w:tr>
+      <w:tr>
+        <w:tc>
+          <w:p>
+            <w:pPr>
+              <w:pStyle w:val="Compact"/>
+              <w:jc w:val="left"/>
+            </w:pPr>
+            <w:r>
+              <w:t xml:space="preserve">Pre-Rede Cegonha (2000–2010)</w:t>
+            </w:r>
+          </w:p>
+        </w:tc>
+        <w:tc>
+          <w:p>
+            <w:pPr>
+              <w:pStyle w:val="Compact"/>
+              <w:jc w:val="left"/>
+            </w:pPr>
+            <w:r>
+              <w:t xml:space="preserve">11</w:t>
+            </w:r>
+          </w:p>
+        </w:tc>
+        <w:tc>
+          <w:p>
+            <w:pPr>
+              <w:pStyle w:val="Compact"/>
+              <w:jc w:val="left"/>
+            </w:pPr>
+            <w:r>
+              <w:t xml:space="preserve">63·8</w:t>
+            </w:r>
+          </w:p>
+        </w:tc>
+        <w:tc>
+          <w:p>
+            <w:pPr>
+              <w:pStyle w:val="Compact"/>
+              <w:jc w:val="left"/>
+            </w:pPr>
+            <w:r>
+              <w:t xml:space="preserve">6·9</w:t>
+            </w:r>
+          </w:p>
+        </w:tc>
+        <w:tc>
+          <w:p>
+            <w:pPr>
+              <w:pStyle w:val="Compact"/>
+              <w:jc w:val="left"/>
+            </w:pPr>
+            <w:r>
+              <w:t xml:space="preserve">52·4</w:t>
+            </w:r>
+          </w:p>
+        </w:tc>
+        <w:tc>
+          <w:p>
+            <w:pPr>
+              <w:pStyle w:val="Compact"/>
+              <w:jc w:val="left"/>
+            </w:pPr>
+            <w:r>
+              <w:t xml:space="preserve">74·0</w:t>
+            </w:r>
+          </w:p>
+        </w:tc>
+        <w:tc>
+          <w:p>
+            <w:pPr>
+              <w:pStyle w:val="Compact"/>
+              <w:jc w:val="left"/>
+            </w:pPr>
+            <w:r>
+              <w:t xml:space="preserve">55·0</w:t>
+            </w:r>
+          </w:p>
+        </w:tc>
+        <w:tc>
+          <w:p>
+            <w:pPr>
+              <w:pStyle w:val="Compact"/>
+              <w:jc w:val="left"/>
+            </w:pPr>
+            <w:r>
+              <w:t xml:space="preserve">44·7</w:t>
+            </w:r>
+          </w:p>
+        </w:tc>
+        <w:tc>
+          <w:p>
+            <w:pPr>
+              <w:pStyle w:val="Compact"/>
+              <w:jc w:val="left"/>
+            </w:pPr>
+            <w:r>
+              <w:t xml:space="preserve">41·1</w:t>
+            </w:r>
+          </w:p>
+        </w:tc>
+        <w:tc>
+          <w:p>
+            <w:pPr>
+              <w:pStyle w:val="Compact"/>
+              <w:jc w:val="left"/>
+            </w:pPr>
+            <w:r>
+              <w:t xml:space="preserve">0·633</w:t>
+            </w:r>
+          </w:p>
+        </w:tc>
+      </w:tr>
+      <w:tr>
+        <w:tc>
+          <w:p>
+            <w:pPr>
+              <w:pStyle w:val="Compact"/>
+              <w:jc w:val="left"/>
+            </w:pPr>
+            <w:r>
+              <w:t xml:space="preserve">Post-Rede Cegonha (2011–2019)</w:t>
+            </w:r>
+          </w:p>
+        </w:tc>
+        <w:tc>
+          <w:p>
+            <w:pPr>
+              <w:pStyle w:val="Compact"/>
+              <w:jc w:val="left"/>
+            </w:pPr>
+            <w:r>
+              <w:t xml:space="preserve">9</w:t>
+            </w:r>
+          </w:p>
+        </w:tc>
+        <w:tc>
+          <w:p>
+            <w:pPr>
+              <w:pStyle w:val="Compact"/>
+              <w:jc w:val="left"/>
+            </w:pPr>
+            <w:r>
+              <w:t xml:space="preserve">55·1</w:t>
+            </w:r>
+          </w:p>
+        </w:tc>
+        <w:tc>
+          <w:p>
+            <w:pPr>
+              <w:pStyle w:val="Compact"/>
+              <w:jc w:val="left"/>
+            </w:pPr>
+            <w:r>
+              <w:t xml:space="preserve">1·8</w:t>
+            </w:r>
+          </w:p>
+        </w:tc>
+        <w:tc>
+          <w:p>
+            <w:pPr>
+              <w:pStyle w:val="Compact"/>
+              <w:jc w:val="left"/>
+            </w:pPr>
+            <w:r>
+              <w:t xml:space="preserve">52·4</w:t>
+            </w:r>
+          </w:p>
+        </w:tc>
+        <w:tc>
+          <w:p>
+            <w:pPr>
+              <w:pStyle w:val="Compact"/>
+              <w:jc w:val="left"/>
+            </w:pPr>
+            <w:r>
+              <w:t xml:space="preserve">57·2</w:t>
+            </w:r>
+          </w:p>
+        </w:tc>
+        <w:tc>
+          <w:p>
+            <w:pPr>
+              <w:pStyle w:val="Compact"/>
+              <w:jc w:val="left"/>
+            </w:pPr>
+            <w:r>
+              <w:t xml:space="preserve">72·5</w:t>
+            </w:r>
+          </w:p>
+        </w:tc>
+        <w:tc>
+          <w:p>
+            <w:pPr>
+              <w:pStyle w:val="Compact"/>
+              <w:jc w:val="left"/>
+            </w:pPr>
+            <w:r>
+              <w:t xml:space="preserve">51·7</w:t>
+            </w:r>
+          </w:p>
+        </w:tc>
+        <w:tc>
+          <w:p>
+            <w:pPr>
+              <w:pStyle w:val="Compact"/>
+              <w:jc w:val="left"/>
+            </w:pPr>
+            <w:r>
+              <w:t xml:space="preserve">63·2</w:t>
+            </w:r>
+          </w:p>
+        </w:tc>
+        <w:tc>
+          <w:p>
+            <w:pPr>
+              <w:pStyle w:val="Compact"/>
+              <w:jc w:val="left"/>
+            </w:pPr>
+            <w:r>
+              <w:t xml:space="preserve">0·664</w:t>
+            </w:r>
+          </w:p>
+        </w:tc>
+      </w:tr>
+      <w:tr>
+        <w:tc>
+          <w:p>
+            <w:pPr>
+              <w:pStyle w:val="Compact"/>
+              <w:jc w:val="left"/>
+            </w:pPr>
+            <w:r>
+              <w:t xml:space="preserve">COVID-19 (2020–2021)</w:t>
+            </w:r>
+          </w:p>
+        </w:tc>
+        <w:tc>
+          <w:p>
+            <w:pPr>
+              <w:pStyle w:val="Compact"/>
+              <w:jc w:val="left"/>
+            </w:pPr>
+            <w:r>
+              <w:t xml:space="preserve">2</w:t>
+            </w:r>
+          </w:p>
+        </w:tc>
+        <w:tc>
+          <w:p>
+            <w:pPr>
+              <w:pStyle w:val="Compact"/>
+              <w:jc w:val="left"/>
+            </w:pPr>
+            <w:r>
+              <w:t xml:space="preserve">90·6</w:t>
+            </w:r>
+          </w:p>
+        </w:tc>
+        <w:tc>
+          <w:p>
+            <w:pPr>
+              <w:pStyle w:val="Compact"/>
+              <w:jc w:val="left"/>
+            </w:pPr>
+            <w:r>
+              <w:t xml:space="preserve">16·8</w:t>
+            </w:r>
+          </w:p>
+        </w:tc>
+        <w:tc>
+          <w:p>
+            <w:pPr>
+              <w:pStyle w:val="Compact"/>
+              <w:jc w:val="left"/>
+            </w:pPr>
+            <w:r>
+              <w:t xml:space="preserve">74·7</w:t>
+            </w:r>
+          </w:p>
+        </w:tc>
+        <w:tc>
+          <w:p>
+            <w:pPr>
+              <w:pStyle w:val="Compact"/>
+              <w:jc w:val="left"/>
+            </w:pPr>
+            <w:r>
+              <w:t xml:space="preserve">107·5</w:t>
+            </w:r>
+          </w:p>
+        </w:tc>
+        <w:tc>
+          <w:p>
+            <w:pPr>
+              <w:pStyle w:val="Compact"/>
+              <w:jc w:val="left"/>
+            </w:pPr>
+            <w:r>
+              <w:t xml:space="preserve">80·3</w:t>
+            </w:r>
+          </w:p>
+        </w:tc>
+        <w:tc>
+          <w:p>
+            <w:pPr>
+              <w:pStyle w:val="Compact"/>
+              <w:jc w:val="left"/>
+            </w:pPr>
+            <w:r>
+              <w:t xml:space="preserve">55·2</w:t>
+            </w:r>
+          </w:p>
+        </w:tc>
+        <w:tc>
+          <w:p>
+            <w:pPr>
+              <w:pStyle w:val="Compact"/>
+              <w:jc w:val="left"/>
+            </w:pPr>
+            <w:r>
+              <w:t xml:space="preserve">73·5</w:t>
+            </w:r>
+          </w:p>
+        </w:tc>
+        <w:tc>
+          <w:p>
+            <w:pPr>
+              <w:pStyle w:val="Compact"/>
+              <w:jc w:val="left"/>
+            </w:pPr>
+            <w:r>
+              <w:t xml:space="preserve">0·692</w:t>
+            </w:r>
+          </w:p>
+        </w:tc>
+      </w:tr>
+      <w:tr>
+        <w:tc>
+          <w:p>
+            <w:pPr>
+              <w:pStyle w:val="Compact"/>
+              <w:jc w:val="left"/>
+            </w:pPr>
+            <w:r>
+              <w:t xml:space="preserve">Post-pandemic (2022–2023)</w:t>
+            </w:r>
+          </w:p>
+        </w:tc>
+        <w:tc>
+          <w:p>
+            <w:pPr>
+              <w:pStyle w:val="Compact"/>
+              <w:jc w:val="left"/>
+            </w:pPr>
+            <w:r>
+              <w:t xml:space="preserve">2</w:t>
+            </w:r>
+          </w:p>
+        </w:tc>
+        <w:tc>
+          <w:p>
+            <w:pPr>
+              <w:pStyle w:val="Compact"/>
+              <w:jc w:val="left"/>
+            </w:pPr>
+            <w:r>
+              <w:t xml:space="preserve">58·2</w:t>
+            </w:r>
+          </w:p>
+        </w:tc>
+        <w:tc>
+          <w:p>
+            <w:pPr>
+              <w:pStyle w:val="Compact"/>
+              <w:jc w:val="left"/>
+            </w:pPr>
+            <w:r>
+              <w:t xml:space="preserve">3·5</w:t>
+            </w:r>
+          </w:p>
+        </w:tc>
+        <w:tc>
+          <w:p>
+            <w:pPr>
+              <w:pStyle w:val="Compact"/>
+              <w:jc w:val="left"/>
+            </w:pPr>
+            <w:r>
+              <w:t xml:space="preserve">56·0</w:t>
+            </w:r>
+          </w:p>
+        </w:tc>
+        <w:tc>
+          <w:p>
+            <w:pPr>
+              <w:pStyle w:val="Compact"/>
+              <w:jc w:val="left"/>
+            </w:pPr>
+            <w:r>
+              <w:t xml:space="preserve">62·0</w:t>
+            </w:r>
+          </w:p>
+        </w:tc>
+        <w:tc>
+          <w:p>
+            <w:pPr>
+              <w:pStyle w:val="Compact"/>
+              <w:jc w:val="left"/>
+            </w:pPr>
+            <w:r>
+              <w:t xml:space="preserve">83·6</w:t>
+            </w:r>
+          </w:p>
+        </w:tc>
+        <w:tc>
+          <w:p>
+            <w:pPr>
+              <w:pStyle w:val="Compact"/>
+              <w:jc w:val="left"/>
+            </w:pPr>
+            <w:r>
+              <w:t xml:space="preserve">57·0</w:t>
+            </w:r>
+          </w:p>
+        </w:tc>
+        <w:tc>
+          <w:p>
+            <w:pPr>
+              <w:pStyle w:val="Compact"/>
+              <w:jc w:val="left"/>
+            </w:pPr>
+            <w:r>
+              <w:t xml:space="preserve">76·1</w:t>
+            </w:r>
+          </w:p>
+        </w:tc>
+        <w:tc>
+          <w:p>
+            <w:pPr>
+              <w:pStyle w:val="Compact"/>
+              <w:jc w:val="left"/>
+            </w:pPr>
+            <w:r>
+              <w:t xml:space="preserve">0·700</w:t>
+            </w:r>
+          </w:p>
+        </w:tc>
+      </w:tr>
+    </w:tbl>
+    <w:p>
+      <w:pPr>
+        <w:pStyle w:val="BodyText"/>
+      </w:pPr>
+      <w:r>
+        <w:rPr>
+          <w:iCs/>
+          <w:i/>
+        </w:rPr>
+        <w:t xml:space="preserve">MMR = maternal mortality ratio (per 100 000 livebirths); SD = standard deviation; FHS = Family Health Strategy; HDI = Human Development Index.</w:t>
+      </w:r>
+    </w:p>
+    <w:p>
+      <w:pPr>
+        <w:pStyle w:val="CaptionedFigure"/>
+      </w:pPr>
+      <w:r>
+        <w:drawing>
+          <wp:inline>
+            <wp:extent cx="5334000" cy="3200400"/>
+            <wp:effectExtent b="0" l="0" r="0" t="0"/>
+            <wp:docPr descr="Figure 1. Trends in the maternal mortality ratio in Brazil, 2000–2023" title="" id="1" name="Picture"/>
+            <a:graphic>
+              <a:graphicData uri="http://schemas.openxmlformats.org/drawingml/2006/picture">
+                <pic:pic>
+                  <pic:nvPicPr>
+                    <pic:cNvPr descr="resultados/figuras_publicacao/figure1.png" id="0" name="Picture"/>
+                    <pic:cNvPicPr>
+                      <a:picLocks noChangeArrowheads="1" noChangeAspect="1"/>
+                    </pic:cNvPicPr>
+                  </pic:nvPicPr>
+                  <pic:blipFill>
+                    <a:blip r:embed="rId33"/>
+                    <a:stretch>
+                      <a:fillRect/>
+                    </a:stretch>
+                  </pic:blipFill>
+                  <pic:spPr bwMode="auto">
+                    <a:xfrm>
+                      <a:off x="0" y="0"/>
+                      <a:ext cx="5334000" cy="3200400"/>
+                    </a:xfrm>
+                    <a:prstGeom prst="rect">
+                      <a:avLst/>
+                    </a:prstGeom>
+                    <a:noFill/>
+                    <a:ln w="9525">
+                      <a:noFill/>
+                      <a:headEnd/>
+                      <a:tailEnd/>
+                    </a:ln>
+                  </pic:spPr>
+                </pic:pic>
+              </a:graphicData>
+            </a:graphic>
+          </wp:inline>
+        </w:drawing>
+      </w:r>
+    </w:p>
+    <w:p>
+      <w:pPr>
+        <w:pStyle w:val="ImageCaption"/>
+      </w:pPr>
+      <w:r>
+        <w:t xml:space="preserve">Figure 1. Trends in the maternal mortality ratio in Brazil, 2000–2023</w:t>
+      </w:r>
+    </w:p>
+    <w:p>
+      <w:pPr>
+        <w:pStyle w:val="BodyText"/>
+      </w:pPr>
+      <w:r>
         <w:t xml:space="preserve">The age-standardised MMR followed a pattern closely parallel to the crude MMR, confirming that observed trends were not driven by changes in the age composition of mothers over time.</w:t>
       </w:r>
     </w:p>
@@ -906,8 +1564,454 @@
         <w:t xml:space="preserve">Prais-Winsten regression showed a statistically significant declining trend during the pre-Rede Cegonha period (2000–2010; APC −2·94%, 95% CI −3·13 to −2·74). During 2011–2019, the trend reversed to a slight but significant increase (APC 0·70%, 0·06 to 1·34). For the overall period (2000–2023), the APC was −0·50% (−2·08 to 1·11), which was not statistically significant owing to the opposing trends before and after 2011 and the COVID-19 disruption (table 5).</w:t>
       </w:r>
     </w:p>
-    <w:bookmarkEnd w:id="33"/>
-    <w:bookmarkStart w:id="34" w:name="regional-patterns"/>
+    <w:p>
+      <w:pPr>
+        <w:pStyle w:val="BodyText"/>
+      </w:pPr>
+      <w:r>
+        <w:rPr>
+          <w:bCs/>
+          <w:b/>
+        </w:rPr>
+        <w:t xml:space="preserve">Table 5. Annual percentage change (APC) of MMR — Prais-Winsten regression, Brazil, 2000–2023</w:t>
+      </w:r>
+    </w:p>
+    <w:tbl>
+      <w:tblPr>
+        <w:tblStyle w:val="Table"/>
+        <w:tblW w:type="pct" w:w="0.0"/>
+        <w:tblLook w:firstRow="1" w:lastRow="0" w:firstColumn="0" w:lastColumn="0" w:noHBand="0" w:noVBand="0" w:val="0020"/>
+      </w:tblPr>
+      <w:tblGrid/>
+      <w:tr>
+        <w:tc>
+          <w:p>
+            <w:pPr>
+              <w:pStyle w:val="Compact"/>
+              <w:jc w:val="left"/>
+            </w:pPr>
+            <w:r>
+              <w:t xml:space="preserve">Stratum</w:t>
+            </w:r>
+          </w:p>
+        </w:tc>
+        <w:tc>
+          <w:p>
+            <w:pPr>
+              <w:pStyle w:val="Compact"/>
+              <w:jc w:val="left"/>
+            </w:pPr>
+            <w:r>
+              <w:t xml:space="preserve">APC % (95% CI)</w:t>
+            </w:r>
+          </w:p>
+        </w:tc>
+        <w:tc>
+          <w:p>
+            <w:pPr>
+              <w:pStyle w:val="Compact"/>
+              <w:jc w:val="left"/>
+            </w:pPr>
+            <w:r>
+              <w:t xml:space="preserve">p-value</w:t>
+            </w:r>
+          </w:p>
+        </w:tc>
+        <w:tc>
+          <w:p>
+            <w:pPr>
+              <w:pStyle w:val="Compact"/>
+              <w:jc w:val="left"/>
+            </w:pPr>
+            <w:r>
+              <w:t xml:space="preserve">Trend</w:t>
+            </w:r>
+          </w:p>
+        </w:tc>
+      </w:tr>
+      <w:tr>
+        <w:tc>
+          <w:p>
+            <w:pPr>
+              <w:pStyle w:val="Compact"/>
+              <w:jc w:val="left"/>
+            </w:pPr>
+            <w:r>
+              <w:t xml:space="preserve">Pre-Rede Cegonha (2000–2010)</w:t>
+            </w:r>
+          </w:p>
+        </w:tc>
+        <w:tc>
+          <w:p>
+            <w:pPr>
+              <w:pStyle w:val="Compact"/>
+              <w:jc w:val="left"/>
+            </w:pPr>
+            <w:r>
+              <w:t xml:space="preserve">−2·94 (−3·13; −2·74)</w:t>
+            </w:r>
+          </w:p>
+        </w:tc>
+        <w:tc>
+          <w:p>
+            <w:pPr>
+              <w:pStyle w:val="Compact"/>
+              <w:jc w:val="left"/>
+            </w:pPr>
+            <w:r>
+              <w:t xml:space="preserve">&lt;0·001</w:t>
+            </w:r>
+          </w:p>
+        </w:tc>
+        <w:tc>
+          <w:p>
+            <w:pPr>
+              <w:pStyle w:val="Compact"/>
+              <w:jc w:val="left"/>
+            </w:pPr>
+            <w:r>
+              <w:t xml:space="preserve">Declining</w:t>
+            </w:r>
+          </w:p>
+        </w:tc>
+      </w:tr>
+      <w:tr>
+        <w:tc>
+          <w:p>
+            <w:pPr>
+              <w:pStyle w:val="Compact"/>
+              <w:jc w:val="left"/>
+            </w:pPr>
+            <w:r>
+              <w:t xml:space="preserve">Post-Rede Cegonha (2011–2019)</w:t>
+            </w:r>
+          </w:p>
+        </w:tc>
+        <w:tc>
+          <w:p>
+            <w:pPr>
+              <w:pStyle w:val="Compact"/>
+              <w:jc w:val="left"/>
+            </w:pPr>
+            <w:r>
+              <w:t xml:space="preserve">0·70 (0·06; 1·34)</w:t>
+            </w:r>
+          </w:p>
+        </w:tc>
+        <w:tc>
+          <w:p>
+            <w:pPr>
+              <w:pStyle w:val="Compact"/>
+              <w:jc w:val="left"/>
+            </w:pPr>
+            <w:r>
+              <w:t xml:space="preserve">0·031</w:t>
+            </w:r>
+          </w:p>
+        </w:tc>
+        <w:tc>
+          <w:p>
+            <w:pPr>
+              <w:pStyle w:val="Compact"/>
+              <w:jc w:val="left"/>
+            </w:pPr>
+            <w:r>
+              <w:t xml:space="preserve">Increasing</w:t>
+            </w:r>
+          </w:p>
+        </w:tc>
+      </w:tr>
+      <w:tr>
+        <w:tc>
+          <w:p>
+            <w:pPr>
+              <w:pStyle w:val="Compact"/>
+              <w:jc w:val="left"/>
+            </w:pPr>
+            <w:r>
+              <w:t xml:space="preserve">Pre-COVID (2000–2019)</w:t>
+            </w:r>
+          </w:p>
+        </w:tc>
+        <w:tc>
+          <w:p>
+            <w:pPr>
+              <w:pStyle w:val="Compact"/>
+              <w:jc w:val="left"/>
+            </w:pPr>
+            <w:r>
+              <w:t xml:space="preserve">−1·25 (−2·32; −0·17)</w:t>
+            </w:r>
+          </w:p>
+        </w:tc>
+        <w:tc>
+          <w:p>
+            <w:pPr>
+              <w:pStyle w:val="Compact"/>
+              <w:jc w:val="left"/>
+            </w:pPr>
+            <w:r>
+              <w:t xml:space="preserve">0·024</w:t>
+            </w:r>
+          </w:p>
+        </w:tc>
+        <w:tc>
+          <w:p>
+            <w:pPr>
+              <w:pStyle w:val="Compact"/>
+              <w:jc w:val="left"/>
+            </w:pPr>
+            <w:r>
+              <w:t xml:space="preserve">Declining</w:t>
+            </w:r>
+          </w:p>
+        </w:tc>
+      </w:tr>
+      <w:tr>
+        <w:tc>
+          <w:p>
+            <w:pPr>
+              <w:pStyle w:val="Compact"/>
+              <w:jc w:val="left"/>
+            </w:pPr>
+            <w:r>
+              <w:t xml:space="preserve">North</w:t>
+            </w:r>
+          </w:p>
+        </w:tc>
+        <w:tc>
+          <w:p>
+            <w:pPr>
+              <w:pStyle w:val="Compact"/>
+              <w:jc w:val="left"/>
+            </w:pPr>
+            <w:r>
+              <w:t xml:space="preserve">−0·41 (−1·98; 1·19)</w:t>
+            </w:r>
+          </w:p>
+        </w:tc>
+        <w:tc>
+          <w:p>
+            <w:pPr>
+              <w:pStyle w:val="Compact"/>
+              <w:jc w:val="left"/>
+            </w:pPr>
+            <w:r>
+              <w:t xml:space="preserve">0·612</w:t>
+            </w:r>
+          </w:p>
+        </w:tc>
+        <w:tc>
+          <w:p>
+            <w:pPr>
+              <w:pStyle w:val="Compact"/>
+              <w:jc w:val="left"/>
+            </w:pPr>
+            <w:r>
+              <w:t xml:space="preserve">Stationary</w:t>
+            </w:r>
+          </w:p>
+        </w:tc>
+      </w:tr>
+      <w:tr>
+        <w:tc>
+          <w:p>
+            <w:pPr>
+              <w:pStyle w:val="Compact"/>
+              <w:jc w:val="left"/>
+            </w:pPr>
+            <w:r>
+              <w:t xml:space="preserve">Northeast</w:t>
+            </w:r>
+          </w:p>
+        </w:tc>
+        <w:tc>
+          <w:p>
+            <w:pPr>
+              <w:pStyle w:val="Compact"/>
+              <w:jc w:val="left"/>
+            </w:pPr>
+            <w:r>
+              <w:t xml:space="preserve">−0·41 (−2·05; 1·26)</w:t>
+            </w:r>
+          </w:p>
+        </w:tc>
+        <w:tc>
+          <w:p>
+            <w:pPr>
+              <w:pStyle w:val="Compact"/>
+              <w:jc w:val="left"/>
+            </w:pPr>
+            <w:r>
+              <w:t xml:space="preserve">0·629</w:t>
+            </w:r>
+          </w:p>
+        </w:tc>
+        <w:tc>
+          <w:p>
+            <w:pPr>
+              <w:pStyle w:val="Compact"/>
+              <w:jc w:val="left"/>
+            </w:pPr>
+            <w:r>
+              <w:t xml:space="preserve">Stationary</w:t>
+            </w:r>
+          </w:p>
+        </w:tc>
+      </w:tr>
+      <w:tr>
+        <w:tc>
+          <w:p>
+            <w:pPr>
+              <w:pStyle w:val="Compact"/>
+              <w:jc w:val="left"/>
+            </w:pPr>
+            <w:r>
+              <w:t xml:space="preserve">Southeast</w:t>
+            </w:r>
+          </w:p>
+        </w:tc>
+        <w:tc>
+          <w:p>
+            <w:pPr>
+              <w:pStyle w:val="Compact"/>
+              <w:jc w:val="left"/>
+            </w:pPr>
+            <w:r>
+              <w:t xml:space="preserve">−0·86 (−2·45; 0·77)</w:t>
+            </w:r>
+          </w:p>
+        </w:tc>
+        <w:tc>
+          <w:p>
+            <w:pPr>
+              <w:pStyle w:val="Compact"/>
+              <w:jc w:val="left"/>
+            </w:pPr>
+            <w:r>
+              <w:t xml:space="preserve">0·299</w:t>
+            </w:r>
+          </w:p>
+        </w:tc>
+        <w:tc>
+          <w:p>
+            <w:pPr>
+              <w:pStyle w:val="Compact"/>
+              <w:jc w:val="left"/>
+            </w:pPr>
+            <w:r>
+              <w:t xml:space="preserve">Stationary</w:t>
+            </w:r>
+          </w:p>
+        </w:tc>
+      </w:tr>
+      <w:tr>
+        <w:tc>
+          <w:p>
+            <w:pPr>
+              <w:pStyle w:val="Compact"/>
+              <w:jc w:val="left"/>
+            </w:pPr>
+            <w:r>
+              <w:t xml:space="preserve">South</w:t>
+            </w:r>
+          </w:p>
+        </w:tc>
+        <w:tc>
+          <w:p>
+            <w:pPr>
+              <w:pStyle w:val="Compact"/>
+              <w:jc w:val="left"/>
+            </w:pPr>
+            <w:r>
+              <w:t xml:space="preserve">−0·15 (−1·50; 1·22)</w:t>
+            </w:r>
+          </w:p>
+        </w:tc>
+        <w:tc>
+          <w:p>
+            <w:pPr>
+              <w:pStyle w:val="Compact"/>
+              <w:jc w:val="left"/>
+            </w:pPr>
+            <w:r>
+              <w:t xml:space="preserve">0·825</w:t>
+            </w:r>
+          </w:p>
+        </w:tc>
+        <w:tc>
+          <w:p>
+            <w:pPr>
+              <w:pStyle w:val="Compact"/>
+              <w:jc w:val="left"/>
+            </w:pPr>
+            <w:r>
+              <w:t xml:space="preserve">Stationary</w:t>
+            </w:r>
+          </w:p>
+        </w:tc>
+      </w:tr>
+      <w:tr>
+        <w:tc>
+          <w:p>
+            <w:pPr>
+              <w:pStyle w:val="Compact"/>
+              <w:jc w:val="left"/>
+            </w:pPr>
+            <w:r>
+              <w:t xml:space="preserve">Central-West</w:t>
+            </w:r>
+          </w:p>
+        </w:tc>
+        <w:tc>
+          <w:p>
+            <w:pPr>
+              <w:pStyle w:val="Compact"/>
+              <w:jc w:val="left"/>
+            </w:pPr>
+            <w:r>
+              <w:t xml:space="preserve">−0·64 (−2·26; 1·00)</w:t>
+            </w:r>
+          </w:p>
+        </w:tc>
+        <w:tc>
+          <w:p>
+            <w:pPr>
+              <w:pStyle w:val="Compact"/>
+              <w:jc w:val="left"/>
+            </w:pPr>
+            <w:r>
+              <w:t xml:space="preserve">0·442</w:t>
+            </w:r>
+          </w:p>
+        </w:tc>
+        <w:tc>
+          <w:p>
+            <w:pPr>
+              <w:pStyle w:val="Compact"/>
+              <w:jc w:val="left"/>
+            </w:pPr>
+            <w:r>
+              <w:t xml:space="preserve">Stationary</w:t>
+            </w:r>
+          </w:p>
+        </w:tc>
+      </w:tr>
+    </w:tbl>
+    <w:p>
+      <w:pPr>
+        <w:pStyle w:val="BodyText"/>
+      </w:pPr>
+      <w:r>
+        <w:rPr>
+          <w:iCs/>
+          <w:i/>
+        </w:rPr>
+        <w:t xml:space="preserve">APC = annual percentage change. GLS regression with AR(1) correction applied to log(MMR).</w:t>
+      </w:r>
+    </w:p>
+    <w:bookmarkEnd w:id="34"/>
+    <w:bookmarkStart w:id="36" w:name="regional-patterns"/>
     <w:p>
       <w:pPr>
         <w:pStyle w:val="Heading3"/>
@@ -921,11 +2025,428 @@
         <w:pStyle w:val="FirstParagraph"/>
       </w:pPr>
       <w:r>
-        <w:t xml:space="preserve">The North region consistently had the highest MMR throughout the study period, averaging 1·35 times the national ratio, followed by the Northeast (1·20 times). The Southeast and South had MMR below the national average (0·85 and 0·75 times, respectively). All regions showed similar temporal patterns—declining MMR from 2000 to 2010, stagnation from 2011 to 2019, and a sharp spike in 2020–2021—but the magnitude of the COVID-19 surge was greatest in the North (figure 2, table 2).</w:t>
-      </w:r>
-    </w:p>
-    <w:bookmarkEnd w:id="34"/>
-    <w:bookmarkStart w:id="35" w:name="racial-and-ethnic-inequalities"/>
+        <w:t xml:space="preserve">The North region consistently had the highest MMR throughout the study period, averaging 1·35 times the national ratio, followed by the Northeast (1·20 times). The Southeast and South had MMR below the national average (0·85 and 0·75 times, respectively). All regions showed similar temporal patterns—declining MMR from 2000 to 2010, stagnation from 2011 to 2019, and a sharp spike in 2020–2021—but the magnitude of the COVID-19 surge was greatest in the North (figure 2).</w:t>
+      </w:r>
+    </w:p>
+    <w:p>
+      <w:pPr>
+        <w:pStyle w:val="BodyText"/>
+      </w:pPr>
+      <w:r>
+        <w:rPr>
+          <w:bCs/>
+          <w:b/>
+        </w:rPr>
+        <w:t xml:space="preserve">Table 2. Mean maternal mortality ratio by region and period, Brazil, 2000–2023 (per 100 000 livebirths)</w:t>
+      </w:r>
+    </w:p>
+    <w:tbl>
+      <w:tblPr>
+        <w:tblStyle w:val="Table"/>
+        <w:tblW w:type="pct" w:w="0.0"/>
+        <w:tblLook w:firstRow="1" w:lastRow="0" w:firstColumn="0" w:lastColumn="0" w:noHBand="0" w:noVBand="0" w:val="0020"/>
+      </w:tblPr>
+      <w:tblGrid/>
+      <w:tr>
+        <w:tc>
+          <w:p>
+            <w:pPr>
+              <w:pStyle w:val="Compact"/>
+              <w:jc w:val="left"/>
+            </w:pPr>
+            <w:r>
+              <w:t xml:space="preserve">Region</w:t>
+            </w:r>
+          </w:p>
+        </w:tc>
+        <w:tc>
+          <w:p>
+            <w:pPr>
+              <w:pStyle w:val="Compact"/>
+              <w:jc w:val="left"/>
+            </w:pPr>
+            <w:r>
+              <w:t xml:space="preserve">2000–2010</w:t>
+            </w:r>
+          </w:p>
+        </w:tc>
+        <w:tc>
+          <w:p>
+            <w:pPr>
+              <w:pStyle w:val="Compact"/>
+              <w:jc w:val="left"/>
+            </w:pPr>
+            <w:r>
+              <w:t xml:space="preserve">2011–2019</w:t>
+            </w:r>
+          </w:p>
+        </w:tc>
+        <w:tc>
+          <w:p>
+            <w:pPr>
+              <w:pStyle w:val="Compact"/>
+              <w:jc w:val="left"/>
+            </w:pPr>
+            <w:r>
+              <w:t xml:space="preserve">2020–2021</w:t>
+            </w:r>
+          </w:p>
+        </w:tc>
+        <w:tc>
+          <w:p>
+            <w:pPr>
+              <w:pStyle w:val="Compact"/>
+              <w:jc w:val="left"/>
+            </w:pPr>
+            <w:r>
+              <w:t xml:space="preserve">2022–2023</w:t>
+            </w:r>
+          </w:p>
+        </w:tc>
+      </w:tr>
+      <w:tr>
+        <w:tc>
+          <w:p>
+            <w:pPr>
+              <w:pStyle w:val="Compact"/>
+              <w:jc w:val="left"/>
+            </w:pPr>
+            <w:r>
+              <w:t xml:space="preserve">North</w:t>
+            </w:r>
+          </w:p>
+        </w:tc>
+        <w:tc>
+          <w:p>
+            <w:pPr>
+              <w:pStyle w:val="Compact"/>
+              <w:jc w:val="left"/>
+            </w:pPr>
+            <w:r>
+              <w:t xml:space="preserve">86·3</w:t>
+            </w:r>
+          </w:p>
+        </w:tc>
+        <w:tc>
+          <w:p>
+            <w:pPr>
+              <w:pStyle w:val="Compact"/>
+              <w:jc w:val="left"/>
+            </w:pPr>
+            <w:r>
+              <w:t xml:space="preserve">74·2</w:t>
+            </w:r>
+          </w:p>
+        </w:tc>
+        <w:tc>
+          <w:p>
+            <w:pPr>
+              <w:pStyle w:val="Compact"/>
+              <w:jc w:val="left"/>
+            </w:pPr>
+            <w:r>
+              <w:t xml:space="preserve">122·3</w:t>
+            </w:r>
+          </w:p>
+        </w:tc>
+        <w:tc>
+          <w:p>
+            <w:pPr>
+              <w:pStyle w:val="Compact"/>
+              <w:jc w:val="left"/>
+            </w:pPr>
+            <w:r>
+              <w:t xml:space="preserve">78·5</w:t>
+            </w:r>
+          </w:p>
+        </w:tc>
+      </w:tr>
+      <w:tr>
+        <w:tc>
+          <w:p>
+            <w:pPr>
+              <w:pStyle w:val="Compact"/>
+              <w:jc w:val="left"/>
+            </w:pPr>
+            <w:r>
+              <w:t xml:space="preserve">Northeast</w:t>
+            </w:r>
+          </w:p>
+        </w:tc>
+        <w:tc>
+          <w:p>
+            <w:pPr>
+              <w:pStyle w:val="Compact"/>
+              <w:jc w:val="left"/>
+            </w:pPr>
+            <w:r>
+              <w:t xml:space="preserve">76·5</w:t>
+            </w:r>
+          </w:p>
+        </w:tc>
+        <w:tc>
+          <w:p>
+            <w:pPr>
+              <w:pStyle w:val="Compact"/>
+              <w:jc w:val="left"/>
+            </w:pPr>
+            <w:r>
+              <w:t xml:space="preserve">66·1</w:t>
+            </w:r>
+          </w:p>
+        </w:tc>
+        <w:tc>
+          <w:p>
+            <w:pPr>
+              <w:pStyle w:val="Compact"/>
+              <w:jc w:val="left"/>
+            </w:pPr>
+            <w:r>
+              <w:t xml:space="preserve">108·7</w:t>
+            </w:r>
+          </w:p>
+        </w:tc>
+        <w:tc>
+          <w:p>
+            <w:pPr>
+              <w:pStyle w:val="Compact"/>
+              <w:jc w:val="left"/>
+            </w:pPr>
+            <w:r>
+              <w:t xml:space="preserve">69·8</w:t>
+            </w:r>
+          </w:p>
+        </w:tc>
+      </w:tr>
+      <w:tr>
+        <w:tc>
+          <w:p>
+            <w:pPr>
+              <w:pStyle w:val="Compact"/>
+              <w:jc w:val="left"/>
+            </w:pPr>
+            <w:r>
+              <w:t xml:space="preserve">Southeast</w:t>
+            </w:r>
+          </w:p>
+        </w:tc>
+        <w:tc>
+          <w:p>
+            <w:pPr>
+              <w:pStyle w:val="Compact"/>
+              <w:jc w:val="left"/>
+            </w:pPr>
+            <w:r>
+              <w:t xml:space="preserve">54·2</w:t>
+            </w:r>
+          </w:p>
+        </w:tc>
+        <w:tc>
+          <w:p>
+            <w:pPr>
+              <w:pStyle w:val="Compact"/>
+              <w:jc w:val="left"/>
+            </w:pPr>
+            <w:r>
+              <w:t xml:space="preserve">46·8</w:t>
+            </w:r>
+          </w:p>
+        </w:tc>
+        <w:tc>
+          <w:p>
+            <w:pPr>
+              <w:pStyle w:val="Compact"/>
+              <w:jc w:val="left"/>
+            </w:pPr>
+            <w:r>
+              <w:t xml:space="preserve">77·0</w:t>
+            </w:r>
+          </w:p>
+        </w:tc>
+        <w:tc>
+          <w:p>
+            <w:pPr>
+              <w:pStyle w:val="Compact"/>
+              <w:jc w:val="left"/>
+            </w:pPr>
+            <w:r>
+              <w:t xml:space="preserve">49·5</w:t>
+            </w:r>
+          </w:p>
+        </w:tc>
+      </w:tr>
+      <w:tr>
+        <w:tc>
+          <w:p>
+            <w:pPr>
+              <w:pStyle w:val="Compact"/>
+              <w:jc w:val="left"/>
+            </w:pPr>
+            <w:r>
+              <w:t xml:space="preserve">South</w:t>
+            </w:r>
+          </w:p>
+        </w:tc>
+        <w:tc>
+          <w:p>
+            <w:pPr>
+              <w:pStyle w:val="Compact"/>
+              <w:jc w:val="left"/>
+            </w:pPr>
+            <w:r>
+              <w:t xml:space="preserve">47·8</w:t>
+            </w:r>
+          </w:p>
+        </w:tc>
+        <w:tc>
+          <w:p>
+            <w:pPr>
+              <w:pStyle w:val="Compact"/>
+              <w:jc w:val="left"/>
+            </w:pPr>
+            <w:r>
+              <w:t xml:space="preserve">41·3</w:t>
+            </w:r>
+          </w:p>
+        </w:tc>
+        <w:tc>
+          <w:p>
+            <w:pPr>
+              <w:pStyle w:val="Compact"/>
+              <w:jc w:val="left"/>
+            </w:pPr>
+            <w:r>
+              <w:t xml:space="preserve">67·9</w:t>
+            </w:r>
+          </w:p>
+        </w:tc>
+        <w:tc>
+          <w:p>
+            <w:pPr>
+              <w:pStyle w:val="Compact"/>
+              <w:jc w:val="left"/>
+            </w:pPr>
+            <w:r>
+              <w:t xml:space="preserve">43·6</w:t>
+            </w:r>
+          </w:p>
+        </w:tc>
+      </w:tr>
+      <w:tr>
+        <w:tc>
+          <w:p>
+            <w:pPr>
+              <w:pStyle w:val="Compact"/>
+              <w:jc w:val="left"/>
+            </w:pPr>
+            <w:r>
+              <w:t xml:space="preserve">Central-West</w:t>
+            </w:r>
+          </w:p>
+        </w:tc>
+        <w:tc>
+          <w:p>
+            <w:pPr>
+              <w:pStyle w:val="Compact"/>
+              <w:jc w:val="left"/>
+            </w:pPr>
+            <w:r>
+              <w:t xml:space="preserve">57·4</w:t>
+            </w:r>
+          </w:p>
+        </w:tc>
+        <w:tc>
+          <w:p>
+            <w:pPr>
+              <w:pStyle w:val="Compact"/>
+              <w:jc w:val="left"/>
+            </w:pPr>
+            <w:r>
+              <w:t xml:space="preserve">49·6</w:t>
+            </w:r>
+          </w:p>
+        </w:tc>
+        <w:tc>
+          <w:p>
+            <w:pPr>
+              <w:pStyle w:val="Compact"/>
+              <w:jc w:val="left"/>
+            </w:pPr>
+            <w:r>
+              <w:t xml:space="preserve">81·5</w:t>
+            </w:r>
+          </w:p>
+        </w:tc>
+        <w:tc>
+          <w:p>
+            <w:pPr>
+              <w:pStyle w:val="Compact"/>
+              <w:jc w:val="left"/>
+            </w:pPr>
+            <w:r>
+              <w:t xml:space="preserve">52·4</w:t>
+            </w:r>
+          </w:p>
+        </w:tc>
+      </w:tr>
+    </w:tbl>
+    <w:p>
+      <w:pPr>
+        <w:pStyle w:val="CaptionedFigure"/>
+      </w:pPr>
+      <w:r>
+        <w:drawing>
+          <wp:inline>
+            <wp:extent cx="5334000" cy="3429000"/>
+            <wp:effectExtent b="0" l="0" r="0" t="0"/>
+            <wp:docPr descr="Figure 2. Maternal mortality ratio by geographic region, Brazil, 2000–2023" title="" id="1" name="Picture"/>
+            <a:graphic>
+              <a:graphicData uri="http://schemas.openxmlformats.org/drawingml/2006/picture">
+                <pic:pic>
+                  <pic:nvPicPr>
+                    <pic:cNvPr descr="resultados/figuras_publicacao/figure2.png" id="0" name="Picture"/>
+                    <pic:cNvPicPr>
+                      <a:picLocks noChangeArrowheads="1" noChangeAspect="1"/>
+                    </pic:cNvPicPr>
+                  </pic:nvPicPr>
+                  <pic:blipFill>
+                    <a:blip r:embed="rId35"/>
+                    <a:stretch>
+                      <a:fillRect/>
+                    </a:stretch>
+                  </pic:blipFill>
+                  <pic:spPr bwMode="auto">
+                    <a:xfrm>
+                      <a:off x="0" y="0"/>
+                      <a:ext cx="5334000" cy="3429000"/>
+                    </a:xfrm>
+                    <a:prstGeom prst="rect">
+                      <a:avLst/>
+                    </a:prstGeom>
+                    <a:noFill/>
+                    <a:ln w="9525">
+                      <a:noFill/>
+                      <a:headEnd/>
+                      <a:tailEnd/>
+                    </a:ln>
+                  </pic:spPr>
+                </pic:pic>
+              </a:graphicData>
+            </a:graphic>
+          </wp:inline>
+        </w:drawing>
+      </w:r>
+    </w:p>
+    <w:p>
+      <w:pPr>
+        <w:pStyle w:val="ImageCaption"/>
+      </w:pPr>
+      <w:r>
+        <w:t xml:space="preserve">Figure 2. Maternal mortality ratio by geographic region, Brazil, 2000–2023</w:t>
+      </w:r>
+    </w:p>
+    <w:bookmarkEnd w:id="36"/>
+    <w:bookmarkStart w:id="38" w:name="racial-and-ethnic-inequalities"/>
     <w:p>
       <w:pPr>
         <w:pStyle w:val="Heading3"/>
@@ -939,11 +2460,428 @@
         <w:pStyle w:val="FirstParagraph"/>
       </w:pPr>
       <w:r>
-        <w:t xml:space="preserve">Indigenous women had the highest MMR throughout the study period, averaging approximately 2·5 times the rate among White women. Black women had an MMR approximately 1·9 times higher than White women, while Brown (Parda) women had an MMR approximately 1·1 times higher. These disparities persisted across all time periods and were exacerbated during the COVID-19 pandemic: the relative increase in MMR from 2019 to 2021 was greatest among Black and Indigenous women (figure 3, table 3).</w:t>
-      </w:r>
-    </w:p>
-    <w:bookmarkEnd w:id="35"/>
-    <w:bookmarkStart w:id="36" w:name="age-and-education-gradients"/>
+        <w:t xml:space="preserve">Indigenous women had the highest MMR throughout the study period, averaging approximately 2·5 times the rate among White women. Black women had an MMR approximately 1·9 times higher than White women, while Brown (Parda) women had an MMR approximately 1·1 times higher. These disparities persisted across all time periods and were exacerbated during the COVID-19 pandemic: the relative increase in MMR from 2019 to 2021 was greatest among Black and Indigenous women (figure 3).</w:t>
+      </w:r>
+    </w:p>
+    <w:p>
+      <w:pPr>
+        <w:pStyle w:val="BodyText"/>
+      </w:pPr>
+      <w:r>
+        <w:rPr>
+          <w:bCs/>
+          <w:b/>
+        </w:rPr>
+        <w:t xml:space="preserve">Table 3. Mean maternal mortality ratio by race/ethnicity and period, Brazil, 2000–2023 (per 100 000 livebirths)</w:t>
+      </w:r>
+    </w:p>
+    <w:tbl>
+      <w:tblPr>
+        <w:tblStyle w:val="Table"/>
+        <w:tblW w:type="pct" w:w="0.0"/>
+        <w:tblLook w:firstRow="1" w:lastRow="0" w:firstColumn="0" w:lastColumn="0" w:noHBand="0" w:noVBand="0" w:val="0020"/>
+      </w:tblPr>
+      <w:tblGrid/>
+      <w:tr>
+        <w:tc>
+          <w:p>
+            <w:pPr>
+              <w:pStyle w:val="Compact"/>
+              <w:jc w:val="left"/>
+            </w:pPr>
+            <w:r>
+              <w:t xml:space="preserve">Race/Ethnicity</w:t>
+            </w:r>
+          </w:p>
+        </w:tc>
+        <w:tc>
+          <w:p>
+            <w:pPr>
+              <w:pStyle w:val="Compact"/>
+              <w:jc w:val="left"/>
+            </w:pPr>
+            <w:r>
+              <w:t xml:space="preserve">2000–2010</w:t>
+            </w:r>
+          </w:p>
+        </w:tc>
+        <w:tc>
+          <w:p>
+            <w:pPr>
+              <w:pStyle w:val="Compact"/>
+              <w:jc w:val="left"/>
+            </w:pPr>
+            <w:r>
+              <w:t xml:space="preserve">2011–2019</w:t>
+            </w:r>
+          </w:p>
+        </w:tc>
+        <w:tc>
+          <w:p>
+            <w:pPr>
+              <w:pStyle w:val="Compact"/>
+              <w:jc w:val="left"/>
+            </w:pPr>
+            <w:r>
+              <w:t xml:space="preserve">2020–2021</w:t>
+            </w:r>
+          </w:p>
+        </w:tc>
+        <w:tc>
+          <w:p>
+            <w:pPr>
+              <w:pStyle w:val="Compact"/>
+              <w:jc w:val="left"/>
+            </w:pPr>
+            <w:r>
+              <w:t xml:space="preserve">2022–2023</w:t>
+            </w:r>
+          </w:p>
+        </w:tc>
+      </w:tr>
+      <w:tr>
+        <w:tc>
+          <w:p>
+            <w:pPr>
+              <w:pStyle w:val="Compact"/>
+              <w:jc w:val="left"/>
+            </w:pPr>
+            <w:r>
+              <w:t xml:space="preserve">White</w:t>
+            </w:r>
+          </w:p>
+        </w:tc>
+        <w:tc>
+          <w:p>
+            <w:pPr>
+              <w:pStyle w:val="Compact"/>
+              <w:jc w:val="left"/>
+            </w:pPr>
+            <w:r>
+              <w:t xml:space="preserve">44·7</w:t>
+            </w:r>
+          </w:p>
+        </w:tc>
+        <w:tc>
+          <w:p>
+            <w:pPr>
+              <w:pStyle w:val="Compact"/>
+              <w:jc w:val="left"/>
+            </w:pPr>
+            <w:r>
+              <w:t xml:space="preserve">38·5</w:t>
+            </w:r>
+          </w:p>
+        </w:tc>
+        <w:tc>
+          <w:p>
+            <w:pPr>
+              <w:pStyle w:val="Compact"/>
+              <w:jc w:val="left"/>
+            </w:pPr>
+            <w:r>
+              <w:t xml:space="preserve">63·4</w:t>
+            </w:r>
+          </w:p>
+        </w:tc>
+        <w:tc>
+          <w:p>
+            <w:pPr>
+              <w:pStyle w:val="Compact"/>
+              <w:jc w:val="left"/>
+            </w:pPr>
+            <w:r>
+              <w:t xml:space="preserve">40·7</w:t>
+            </w:r>
+          </w:p>
+        </w:tc>
+      </w:tr>
+      <w:tr>
+        <w:tc>
+          <w:p>
+            <w:pPr>
+              <w:pStyle w:val="Compact"/>
+              <w:jc w:val="left"/>
+            </w:pPr>
+            <w:r>
+              <w:t xml:space="preserve">Black</w:t>
+            </w:r>
+          </w:p>
+        </w:tc>
+        <w:tc>
+          <w:p>
+            <w:pPr>
+              <w:pStyle w:val="Compact"/>
+              <w:jc w:val="left"/>
+            </w:pPr>
+            <w:r>
+              <w:t xml:space="preserve">121·0</w:t>
+            </w:r>
+          </w:p>
+        </w:tc>
+        <w:tc>
+          <w:p>
+            <w:pPr>
+              <w:pStyle w:val="Compact"/>
+              <w:jc w:val="left"/>
+            </w:pPr>
+            <w:r>
+              <w:t xml:space="preserve">104·3</w:t>
+            </w:r>
+          </w:p>
+        </w:tc>
+        <w:tc>
+          <w:p>
+            <w:pPr>
+              <w:pStyle w:val="Compact"/>
+              <w:jc w:val="left"/>
+            </w:pPr>
+            <w:r>
+              <w:t xml:space="preserve">171·7</w:t>
+            </w:r>
+          </w:p>
+        </w:tc>
+        <w:tc>
+          <w:p>
+            <w:pPr>
+              <w:pStyle w:val="Compact"/>
+              <w:jc w:val="left"/>
+            </w:pPr>
+            <w:r>
+              <w:t xml:space="preserve">110·3</w:t>
+            </w:r>
+          </w:p>
+        </w:tc>
+      </w:tr>
+      <w:tr>
+        <w:tc>
+          <w:p>
+            <w:pPr>
+              <w:pStyle w:val="Compact"/>
+              <w:jc w:val="left"/>
+            </w:pPr>
+            <w:r>
+              <w:t xml:space="preserve">Brown (Parda)</w:t>
+            </w:r>
+          </w:p>
+        </w:tc>
+        <w:tc>
+          <w:p>
+            <w:pPr>
+              <w:pStyle w:val="Compact"/>
+              <w:jc w:val="left"/>
+            </w:pPr>
+            <w:r>
+              <w:t xml:space="preserve">70·2</w:t>
+            </w:r>
+          </w:p>
+        </w:tc>
+        <w:tc>
+          <w:p>
+            <w:pPr>
+              <w:pStyle w:val="Compact"/>
+              <w:jc w:val="left"/>
+            </w:pPr>
+            <w:r>
+              <w:t xml:space="preserve">60·6</w:t>
+            </w:r>
+          </w:p>
+        </w:tc>
+        <w:tc>
+          <w:p>
+            <w:pPr>
+              <w:pStyle w:val="Compact"/>
+              <w:jc w:val="left"/>
+            </w:pPr>
+            <w:r>
+              <w:t xml:space="preserve">99·7</w:t>
+            </w:r>
+          </w:p>
+        </w:tc>
+        <w:tc>
+          <w:p>
+            <w:pPr>
+              <w:pStyle w:val="Compact"/>
+              <w:jc w:val="left"/>
+            </w:pPr>
+            <w:r>
+              <w:t xml:space="preserve">64·1</w:t>
+            </w:r>
+          </w:p>
+        </w:tc>
+      </w:tr>
+      <w:tr>
+        <w:tc>
+          <w:p>
+            <w:pPr>
+              <w:pStyle w:val="Compact"/>
+              <w:jc w:val="left"/>
+            </w:pPr>
+            <w:r>
+              <w:t xml:space="preserve">Indigenous</w:t>
+            </w:r>
+          </w:p>
+        </w:tc>
+        <w:tc>
+          <w:p>
+            <w:pPr>
+              <w:pStyle w:val="Compact"/>
+              <w:jc w:val="left"/>
+            </w:pPr>
+            <w:r>
+              <w:t xml:space="preserve">159·5</w:t>
+            </w:r>
+          </w:p>
+        </w:tc>
+        <w:tc>
+          <w:p>
+            <w:pPr>
+              <w:pStyle w:val="Compact"/>
+              <w:jc w:val="left"/>
+            </w:pPr>
+            <w:r>
+              <w:t xml:space="preserve">137·5</w:t>
+            </w:r>
+          </w:p>
+        </w:tc>
+        <w:tc>
+          <w:p>
+            <w:pPr>
+              <w:pStyle w:val="Compact"/>
+              <w:jc w:val="left"/>
+            </w:pPr>
+            <w:r>
+              <w:t xml:space="preserve">226·5</w:t>
+            </w:r>
+          </w:p>
+        </w:tc>
+        <w:tc>
+          <w:p>
+            <w:pPr>
+              <w:pStyle w:val="Compact"/>
+              <w:jc w:val="left"/>
+            </w:pPr>
+            <w:r>
+              <w:t xml:space="preserve">145·5</w:t>
+            </w:r>
+          </w:p>
+        </w:tc>
+      </w:tr>
+      <w:tr>
+        <w:tc>
+          <w:p>
+            <w:pPr>
+              <w:pStyle w:val="Compact"/>
+              <w:jc w:val="left"/>
+            </w:pPr>
+            <w:r>
+              <w:t xml:space="preserve">Asian (Amarela)</w:t>
+            </w:r>
+          </w:p>
+        </w:tc>
+        <w:tc>
+          <w:p>
+            <w:pPr>
+              <w:pStyle w:val="Compact"/>
+              <w:jc w:val="left"/>
+            </w:pPr>
+            <w:r>
+              <w:t xml:space="preserve">41·5</w:t>
+            </w:r>
+          </w:p>
+        </w:tc>
+        <w:tc>
+          <w:p>
+            <w:pPr>
+              <w:pStyle w:val="Compact"/>
+              <w:jc w:val="left"/>
+            </w:pPr>
+            <w:r>
+              <w:t xml:space="preserve">35·8</w:t>
+            </w:r>
+          </w:p>
+        </w:tc>
+        <w:tc>
+          <w:p>
+            <w:pPr>
+              <w:pStyle w:val="Compact"/>
+              <w:jc w:val="left"/>
+            </w:pPr>
+            <w:r>
+              <w:t xml:space="preserve">58·9</w:t>
+            </w:r>
+          </w:p>
+        </w:tc>
+        <w:tc>
+          <w:p>
+            <w:pPr>
+              <w:pStyle w:val="Compact"/>
+              <w:jc w:val="left"/>
+            </w:pPr>
+            <w:r>
+              <w:t xml:space="preserve">37·8</w:t>
+            </w:r>
+          </w:p>
+        </w:tc>
+      </w:tr>
+    </w:tbl>
+    <w:p>
+      <w:pPr>
+        <w:pStyle w:val="CaptionedFigure"/>
+      </w:pPr>
+      <w:r>
+        <w:drawing>
+          <wp:inline>
+            <wp:extent cx="5334000" cy="3429000"/>
+            <wp:effectExtent b="0" l="0" r="0" t="0"/>
+            <wp:docPr descr="Figure 3. Maternal mortality ratio by race/ethnicity, Brazil, 2000–2023" title="" id="1" name="Picture"/>
+            <a:graphic>
+              <a:graphicData uri="http://schemas.openxmlformats.org/drawingml/2006/picture">
+                <pic:pic>
+                  <pic:nvPicPr>
+                    <pic:cNvPr descr="resultados/figuras_publicacao/figure3.png" id="0" name="Picture"/>
+                    <pic:cNvPicPr>
+                      <a:picLocks noChangeArrowheads="1" noChangeAspect="1"/>
+                    </pic:cNvPicPr>
+                  </pic:nvPicPr>
+                  <pic:blipFill>
+                    <a:blip r:embed="rId37"/>
+                    <a:stretch>
+                      <a:fillRect/>
+                    </a:stretch>
+                  </pic:blipFill>
+                  <pic:spPr bwMode="auto">
+                    <a:xfrm>
+                      <a:off x="0" y="0"/>
+                      <a:ext cx="5334000" cy="3429000"/>
+                    </a:xfrm>
+                    <a:prstGeom prst="rect">
+                      <a:avLst/>
+                    </a:prstGeom>
+                    <a:noFill/>
+                    <a:ln w="9525">
+                      <a:noFill/>
+                      <a:headEnd/>
+                      <a:tailEnd/>
+                    </a:ln>
+                  </pic:spPr>
+                </pic:pic>
+              </a:graphicData>
+            </a:graphic>
+          </wp:inline>
+        </w:drawing>
+      </w:r>
+    </w:p>
+    <w:p>
+      <w:pPr>
+        <w:pStyle w:val="ImageCaption"/>
+      </w:pPr>
+      <w:r>
+        <w:t xml:space="preserve">Figure 3. Maternal mortality ratio by race/ethnicity, Brazil, 2000–2023</w:t>
+      </w:r>
+    </w:p>
+    <w:bookmarkEnd w:id="38"/>
+    <w:bookmarkStart w:id="41" w:name="age-and-education-gradients"/>
     <w:p>
       <w:pPr>
         <w:pStyle w:val="Heading3"/>
@@ -957,7 +2895,7 @@
         <w:pStyle w:val="FirstParagraph"/>
       </w:pPr>
       <w:r>
-        <w:t xml:space="preserve">Women aged 35 years and older had the highest MMR, approximately 1·9 times the overall rate, followed by adolescents (&lt;20 years, approximately 1·15 times). The 20–34-year age group had the lowest risk (figure 4, table 4).</w:t>
+        <w:t xml:space="preserve">Women aged 35 years and older had the highest MMR, approximately 1·9 times the overall rate, followed by adolescents (&lt;20 years, approximately 1·15 times). The 20–34-year age group had the lowest risk (figure 4).</w:t>
       </w:r>
     </w:p>
     <w:p>
@@ -965,11 +2903,369 @@
         <w:pStyle w:val="BodyText"/>
       </w:pPr>
       <w:r>
+        <w:rPr>
+          <w:bCs/>
+          <w:b/>
+        </w:rPr>
+        <w:t xml:space="preserve">Table 4. Mean maternal mortality ratio by maternal age and period, Brazil, 2000–2023 (per 100 000 livebirths)</w:t>
+      </w:r>
+    </w:p>
+    <w:tbl>
+      <w:tblPr>
+        <w:tblStyle w:val="Table"/>
+        <w:tblW w:type="pct" w:w="0.0"/>
+        <w:tblLook w:firstRow="1" w:lastRow="0" w:firstColumn="0" w:lastColumn="0" w:noHBand="0" w:noVBand="0" w:val="0020"/>
+      </w:tblPr>
+      <w:tblGrid/>
+      <w:tr>
+        <w:tc>
+          <w:p>
+            <w:pPr>
+              <w:pStyle w:val="Compact"/>
+              <w:jc w:val="left"/>
+            </w:pPr>
+            <w:r>
+              <w:t xml:space="preserve">Age group</w:t>
+            </w:r>
+          </w:p>
+        </w:tc>
+        <w:tc>
+          <w:p>
+            <w:pPr>
+              <w:pStyle w:val="Compact"/>
+              <w:jc w:val="left"/>
+            </w:pPr>
+            <w:r>
+              <w:t xml:space="preserve">2000–2010</w:t>
+            </w:r>
+          </w:p>
+        </w:tc>
+        <w:tc>
+          <w:p>
+            <w:pPr>
+              <w:pStyle w:val="Compact"/>
+              <w:jc w:val="left"/>
+            </w:pPr>
+            <w:r>
+              <w:t xml:space="preserve">2011–2019</w:t>
+            </w:r>
+          </w:p>
+        </w:tc>
+        <w:tc>
+          <w:p>
+            <w:pPr>
+              <w:pStyle w:val="Compact"/>
+              <w:jc w:val="left"/>
+            </w:pPr>
+            <w:r>
+              <w:t xml:space="preserve">2020–2021</w:t>
+            </w:r>
+          </w:p>
+        </w:tc>
+        <w:tc>
+          <w:p>
+            <w:pPr>
+              <w:pStyle w:val="Compact"/>
+              <w:jc w:val="left"/>
+            </w:pPr>
+            <w:r>
+              <w:t xml:space="preserve">2022–2023</w:t>
+            </w:r>
+          </w:p>
+        </w:tc>
+      </w:tr>
+      <w:tr>
+        <w:tc>
+          <w:p>
+            <w:pPr>
+              <w:pStyle w:val="Compact"/>
+              <w:jc w:val="left"/>
+            </w:pPr>
+            <w:r>
+              <w:t xml:space="preserve">&lt;20 years</w:t>
+            </w:r>
+          </w:p>
+        </w:tc>
+        <w:tc>
+          <w:p>
+            <w:pPr>
+              <w:pStyle w:val="Compact"/>
+              <w:jc w:val="left"/>
+            </w:pPr>
+            <w:r>
+              <w:t xml:space="preserve">73·4</w:t>
+            </w:r>
+          </w:p>
+        </w:tc>
+        <w:tc>
+          <w:p>
+            <w:pPr>
+              <w:pStyle w:val="Compact"/>
+              <w:jc w:val="left"/>
+            </w:pPr>
+            <w:r>
+              <w:t xml:space="preserve">63·4</w:t>
+            </w:r>
+          </w:p>
+        </w:tc>
+        <w:tc>
+          <w:p>
+            <w:pPr>
+              <w:pStyle w:val="Compact"/>
+              <w:jc w:val="left"/>
+            </w:pPr>
+            <w:r>
+              <w:t xml:space="preserve">104·2</w:t>
+            </w:r>
+          </w:p>
+        </w:tc>
+        <w:tc>
+          <w:p>
+            <w:pPr>
+              <w:pStyle w:val="Compact"/>
+              <w:jc w:val="left"/>
+            </w:pPr>
+            <w:r>
+              <w:t xml:space="preserve">66·9</w:t>
+            </w:r>
+          </w:p>
+        </w:tc>
+      </w:tr>
+      <w:tr>
+        <w:tc>
+          <w:p>
+            <w:pPr>
+              <w:pStyle w:val="Compact"/>
+              <w:jc w:val="left"/>
+            </w:pPr>
+            <w:r>
+              <w:t xml:space="preserve">20–34 years</w:t>
+            </w:r>
+          </w:p>
+        </w:tc>
+        <w:tc>
+          <w:p>
+            <w:pPr>
+              <w:pStyle w:val="Compact"/>
+              <w:jc w:val="left"/>
+            </w:pPr>
+            <w:r>
+              <w:t xml:space="preserve">51·0</w:t>
+            </w:r>
+          </w:p>
+        </w:tc>
+        <w:tc>
+          <w:p>
+            <w:pPr>
+              <w:pStyle w:val="Compact"/>
+              <w:jc w:val="left"/>
+            </w:pPr>
+            <w:r>
+              <w:t xml:space="preserve">44·1</w:t>
+            </w:r>
+          </w:p>
+        </w:tc>
+        <w:tc>
+          <w:p>
+            <w:pPr>
+              <w:pStyle w:val="Compact"/>
+              <w:jc w:val="left"/>
+            </w:pPr>
+            <w:r>
+              <w:t xml:space="preserve">72·5</w:t>
+            </w:r>
+          </w:p>
+        </w:tc>
+        <w:tc>
+          <w:p>
+            <w:pPr>
+              <w:pStyle w:val="Compact"/>
+              <w:jc w:val="left"/>
+            </w:pPr>
+            <w:r>
+              <w:t xml:space="preserve">46·6</w:t>
+            </w:r>
+          </w:p>
+        </w:tc>
+      </w:tr>
+      <w:tr>
+        <w:tc>
+          <w:p>
+            <w:pPr>
+              <w:pStyle w:val="Compact"/>
+              <w:jc w:val="left"/>
+            </w:pPr>
+            <w:r>
+              <w:t xml:space="preserve">≥35 years</w:t>
+            </w:r>
+          </w:p>
+        </w:tc>
+        <w:tc>
+          <w:p>
+            <w:pPr>
+              <w:pStyle w:val="Compact"/>
+              <w:jc w:val="left"/>
+            </w:pPr>
+            <w:r>
+              <w:t xml:space="preserve">121·2</w:t>
+            </w:r>
+          </w:p>
+        </w:tc>
+        <w:tc>
+          <w:p>
+            <w:pPr>
+              <w:pStyle w:val="Compact"/>
+              <w:jc w:val="left"/>
+            </w:pPr>
+            <w:r>
+              <w:t xml:space="preserve">104·7</w:t>
+            </w:r>
+          </w:p>
+        </w:tc>
+        <w:tc>
+          <w:p>
+            <w:pPr>
+              <w:pStyle w:val="Compact"/>
+              <w:jc w:val="left"/>
+            </w:pPr>
+            <w:r>
+              <w:t xml:space="preserve">172·1</w:t>
+            </w:r>
+          </w:p>
+        </w:tc>
+        <w:tc>
+          <w:p>
+            <w:pPr>
+              <w:pStyle w:val="Compact"/>
+              <w:jc w:val="left"/>
+            </w:pPr>
+            <w:r>
+              <w:t xml:space="preserve">110·6</w:t>
+            </w:r>
+          </w:p>
+        </w:tc>
+      </w:tr>
+    </w:tbl>
+    <w:p>
+      <w:pPr>
+        <w:pStyle w:val="CaptionedFigure"/>
+      </w:pPr>
+      <w:r>
+        <w:drawing>
+          <wp:inline>
+            <wp:extent cx="5334000" cy="3429000"/>
+            <wp:effectExtent b="0" l="0" r="0" t="0"/>
+            <wp:docPr descr="Figure 4. Maternal mortality ratio by maternal age group, Brazil, 2000–2023" title="" id="1" name="Picture"/>
+            <a:graphic>
+              <a:graphicData uri="http://schemas.openxmlformats.org/drawingml/2006/picture">
+                <pic:pic>
+                  <pic:nvPicPr>
+                    <pic:cNvPr descr="resultados/figuras_publicacao/figure4.png" id="0" name="Picture"/>
+                    <pic:cNvPicPr>
+                      <a:picLocks noChangeArrowheads="1" noChangeAspect="1"/>
+                    </pic:cNvPicPr>
+                  </pic:nvPicPr>
+                  <pic:blipFill>
+                    <a:blip r:embed="rId39"/>
+                    <a:stretch>
+                      <a:fillRect/>
+                    </a:stretch>
+                  </pic:blipFill>
+                  <pic:spPr bwMode="auto">
+                    <a:xfrm>
+                      <a:off x="0" y="0"/>
+                      <a:ext cx="5334000" cy="3429000"/>
+                    </a:xfrm>
+                    <a:prstGeom prst="rect">
+                      <a:avLst/>
+                    </a:prstGeom>
+                    <a:noFill/>
+                    <a:ln w="9525">
+                      <a:noFill/>
+                      <a:headEnd/>
+                      <a:tailEnd/>
+                    </a:ln>
+                  </pic:spPr>
+                </pic:pic>
+              </a:graphicData>
+            </a:graphic>
+          </wp:inline>
+        </w:drawing>
+      </w:r>
+    </w:p>
+    <w:p>
+      <w:pPr>
+        <w:pStyle w:val="ImageCaption"/>
+      </w:pPr>
+      <w:r>
+        <w:t xml:space="preserve">Figure 4. Maternal mortality ratio by maternal age group, Brazil, 2000–2023</w:t>
+      </w:r>
+    </w:p>
+    <w:p>
+      <w:pPr>
+        <w:pStyle w:val="BodyText"/>
+      </w:pPr>
+      <w:r>
         <w:t xml:space="preserve">A steep educational gradient was observed: women with no formal education or incomplete primary schooling had an MMR approximately 1·8 times the national average, while those with complete tertiary education had an MMR less than half the national average (approximately 0·45 times). This gradient was consistent across all periods and widened during the pandemic.</w:t>
       </w:r>
     </w:p>
-    <w:bookmarkEnd w:id="36"/>
-    <w:bookmarkStart w:id="37" w:name="cause-specific-mortality"/>
+    <w:p>
+      <w:pPr>
+        <w:pStyle w:val="CaptionedFigure"/>
+      </w:pPr>
+      <w:r>
+        <w:drawing>
+          <wp:inline>
+            <wp:extent cx="5334000" cy="3200400"/>
+            <wp:effectExtent b="0" l="0" r="0" t="0"/>
+            <wp:docPr descr="Figure 7. Maternal mortality ratio by maternal education level, Brazil, 2000–2023" title="" id="1" name="Picture"/>
+            <a:graphic>
+              <a:graphicData uri="http://schemas.openxmlformats.org/drawingml/2006/picture">
+                <pic:pic>
+                  <pic:nvPicPr>
+                    <pic:cNvPr descr="resultados/figuras_publicacao/figure7.png" id="0" name="Picture"/>
+                    <pic:cNvPicPr>
+                      <a:picLocks noChangeArrowheads="1" noChangeAspect="1"/>
+                    </pic:cNvPicPr>
+                  </pic:nvPicPr>
+                  <pic:blipFill>
+                    <a:blip r:embed="rId40"/>
+                    <a:stretch>
+                      <a:fillRect/>
+                    </a:stretch>
+                  </pic:blipFill>
+                  <pic:spPr bwMode="auto">
+                    <a:xfrm>
+                      <a:off x="0" y="0"/>
+                      <a:ext cx="5334000" cy="3200400"/>
+                    </a:xfrm>
+                    <a:prstGeom prst="rect">
+                      <a:avLst/>
+                    </a:prstGeom>
+                    <a:noFill/>
+                    <a:ln w="9525">
+                      <a:noFill/>
+                      <a:headEnd/>
+                      <a:tailEnd/>
+                    </a:ln>
+                  </pic:spPr>
+                </pic:pic>
+              </a:graphicData>
+            </a:graphic>
+          </wp:inline>
+        </w:drawing>
+      </w:r>
+    </w:p>
+    <w:p>
+      <w:pPr>
+        <w:pStyle w:val="ImageCaption"/>
+      </w:pPr>
+      <w:r>
+        <w:t xml:space="preserve">Figure 7. Maternal mortality ratio by maternal education level, Brazil, 2000–2023</w:t>
+      </w:r>
+    </w:p>
+    <w:bookmarkEnd w:id="41"/>
+    <w:bookmarkStart w:id="43" w:name="cause-specific-mortality"/>
     <w:p>
       <w:pPr>
         <w:pStyle w:val="Heading3"/>
@@ -986,13 +3282,141 @@
         <w:t xml:space="preserve">Hypertensive disorders (pre-eclampsia, eclampsia) were the leading direct cause of maternal death throughout the study period, accounting for approximately 23% of all maternal deaths. Haemorrhage accounted for 10%, puerperal sepsis for 7%, and abortion for 5%. Indirect causes (including cardiovascular, metabolic, and respiratory conditions) represented approximately 30% of maternal deaths in the pre-pandemic period, but rose sharply to over 50% during 2020–2021, driven predominantly by COVID-19 respiratory complications. This shift reversed after 2022 (figure 5).</w:t>
       </w:r>
     </w:p>
-    <w:bookmarkEnd w:id="37"/>
-    <w:bookmarkStart w:id="38" w:name="interrupted-time-series-analysis"/>
+    <w:p>
+      <w:pPr>
+        <w:pStyle w:val="CaptionedFigure"/>
+      </w:pPr>
+      <w:r>
+        <w:drawing>
+          <wp:inline>
+            <wp:extent cx="5334000" cy="3000375"/>
+            <wp:effectExtent b="0" l="0" r="0" t="0"/>
+            <wp:docPr descr="Figure 5. Proportional distribution of causes of maternal death, Brazil, 2000–2023" title="" id="1" name="Picture"/>
+            <a:graphic>
+              <a:graphicData uri="http://schemas.openxmlformats.org/drawingml/2006/picture">
+                <pic:pic>
+                  <pic:nvPicPr>
+                    <pic:cNvPr descr="resultados/figuras_publicacao/figure5.png" id="0" name="Picture"/>
+                    <pic:cNvPicPr>
+                      <a:picLocks noChangeArrowheads="1" noChangeAspect="1"/>
+                    </pic:cNvPicPr>
+                  </pic:nvPicPr>
+                  <pic:blipFill>
+                    <a:blip r:embed="rId42"/>
+                    <a:stretch>
+                      <a:fillRect/>
+                    </a:stretch>
+                  </pic:blipFill>
+                  <pic:spPr bwMode="auto">
+                    <a:xfrm>
+                      <a:off x="0" y="0"/>
+                      <a:ext cx="5334000" cy="3000375"/>
+                    </a:xfrm>
+                    <a:prstGeom prst="rect">
+                      <a:avLst/>
+                    </a:prstGeom>
+                    <a:noFill/>
+                    <a:ln w="9525">
+                      <a:noFill/>
+                      <a:headEnd/>
+                      <a:tailEnd/>
+                    </a:ln>
+                  </pic:spPr>
+                </pic:pic>
+              </a:graphicData>
+            </a:graphic>
+          </wp:inline>
+        </w:drawing>
+      </w:r>
+    </w:p>
+    <w:p>
+      <w:pPr>
+        <w:pStyle w:val="ImageCaption"/>
+      </w:pPr>
+      <w:r>
+        <w:t xml:space="preserve">Figure 5. Proportional distribution of causes of maternal death, Brazil, 2000–2023</w:t>
+      </w:r>
+    </w:p>
+    <w:bookmarkEnd w:id="43"/>
+    <w:bookmarkStart w:id="45" w:name="state-level-variation"/>
     <w:p>
       <w:pPr>
         <w:pStyle w:val="Heading3"/>
       </w:pPr>
       <w:r>
+        <w:t xml:space="preserve">State-level variation</w:t>
+      </w:r>
+    </w:p>
+    <w:p>
+      <w:pPr>
+        <w:pStyle w:val="FirstParagraph"/>
+      </w:pPr>
+      <w:r>
+        <w:t xml:space="preserve">Substantial heterogeneity was observed across the 27 federative units (figure 6). The heatmap reveals a clear North–South gradient in baseline MMR levels, with states in the North (PA, AP, RR, AM) consistently showing the highest ratios. The COVID-19 spike in 2020–2021 was visible across all states but was particularly pronounced in the North and Northeast.</w:t>
+      </w:r>
+    </w:p>
+    <w:p>
+      <w:pPr>
+        <w:pStyle w:val="CaptionedFigure"/>
+      </w:pPr>
+      <w:r>
+        <w:drawing>
+          <wp:inline>
+            <wp:extent cx="5334000" cy="4667250"/>
+            <wp:effectExtent b="0" l="0" r="0" t="0"/>
+            <wp:docPr descr="Figure 6. Heatmap of the maternal mortality ratio by federative unit and year, Brazil, 2000–2023" title="" id="1" name="Picture"/>
+            <a:graphic>
+              <a:graphicData uri="http://schemas.openxmlformats.org/drawingml/2006/picture">
+                <pic:pic>
+                  <pic:nvPicPr>
+                    <pic:cNvPr descr="resultados/figuras_publicacao/figure6.png" id="0" name="Picture"/>
+                    <pic:cNvPicPr>
+                      <a:picLocks noChangeArrowheads="1" noChangeAspect="1"/>
+                    </pic:cNvPicPr>
+                  </pic:nvPicPr>
+                  <pic:blipFill>
+                    <a:blip r:embed="rId44"/>
+                    <a:stretch>
+                      <a:fillRect/>
+                    </a:stretch>
+                  </pic:blipFill>
+                  <pic:spPr bwMode="auto">
+                    <a:xfrm>
+                      <a:off x="0" y="0"/>
+                      <a:ext cx="5334000" cy="4667250"/>
+                    </a:xfrm>
+                    <a:prstGeom prst="rect">
+                      <a:avLst/>
+                    </a:prstGeom>
+                    <a:noFill/>
+                    <a:ln w="9525">
+                      <a:noFill/>
+                      <a:headEnd/>
+                      <a:tailEnd/>
+                    </a:ln>
+                  </pic:spPr>
+                </pic:pic>
+              </a:graphicData>
+            </a:graphic>
+          </wp:inline>
+        </w:drawing>
+      </w:r>
+    </w:p>
+    <w:p>
+      <w:pPr>
+        <w:pStyle w:val="ImageCaption"/>
+      </w:pPr>
+      <w:r>
+        <w:t xml:space="preserve">Figure 6. Heatmap of the maternal mortality ratio by federative unit and year, Brazil, 2000–2023</w:t>
+      </w:r>
+    </w:p>
+    <w:bookmarkEnd w:id="45"/>
+    <w:bookmarkStart w:id="47" w:name="interrupted-time-series-analysis"/>
+    <w:p>
+      <w:pPr>
+        <w:pStyle w:val="Heading3"/>
+      </w:pPr>
+      <w:r>
         <w:t xml:space="preserve">Interrupted time-series analysis</w:t>
       </w:r>
     </w:p>
@@ -1012,13 +3436,826 @@
         <w:t xml:space="preserve">The COVID-19 effect was substantial: the level change coefficient was 0·606 (p &lt; 0·001), corresponding to an approximate 83% increase in the MMR during the pandemic years. The post-COVID slope change was not statistically significant (β = 0·108, p = 0·137), suggesting that the post-pandemic recovery trajectory was not yet clearly established with only two years of post-peak data (table 6, figure 8).</w:t>
       </w:r>
     </w:p>
-    <w:bookmarkEnd w:id="38"/>
-    <w:bookmarkStart w:id="39" w:name="exploratory-forecasts"/>
+    <w:p>
+      <w:pPr>
+        <w:pStyle w:val="BodyText"/>
+      </w:pPr>
+      <w:r>
+        <w:rPr>
+          <w:bCs/>
+          <w:b/>
+        </w:rPr>
+        <w:t xml:space="preserve">Table 6. Interrupted time-series model — effect of Rede Cegonha (2011) and COVID-19 (2020–2021) on log(MMR)</w:t>
+      </w:r>
+    </w:p>
+    <w:tbl>
+      <w:tblPr>
+        <w:tblStyle w:val="Table"/>
+        <w:tblW w:type="pct" w:w="0.0"/>
+        <w:tblLook w:firstRow="1" w:lastRow="0" w:firstColumn="0" w:lastColumn="0" w:noHBand="0" w:noVBand="0" w:val="0020"/>
+      </w:tblPr>
+      <w:tblGrid/>
+      <w:tr>
+        <w:tc>
+          <w:p>
+            <w:pPr>
+              <w:pStyle w:val="Compact"/>
+              <w:jc w:val="left"/>
+            </w:pPr>
+            <w:r>
+              <w:t xml:space="preserve">Parameter</w:t>
+            </w:r>
+          </w:p>
+        </w:tc>
+        <w:tc>
+          <w:p>
+            <w:pPr>
+              <w:pStyle w:val="Compact"/>
+              <w:jc w:val="left"/>
+            </w:pPr>
+            <w:r>
+              <w:t xml:space="preserve">β</w:t>
+            </w:r>
+          </w:p>
+        </w:tc>
+        <w:tc>
+          <w:p>
+            <w:pPr>
+              <w:pStyle w:val="Compact"/>
+              <w:jc w:val="left"/>
+            </w:pPr>
+            <w:r>
+              <w:t xml:space="preserve">SE (Newey-West)</w:t>
+            </w:r>
+          </w:p>
+        </w:tc>
+        <w:tc>
+          <w:p>
+            <w:pPr>
+              <w:pStyle w:val="Compact"/>
+              <w:jc w:val="left"/>
+            </w:pPr>
+            <w:r>
+              <w:t xml:space="preserve">t</w:t>
+            </w:r>
+          </w:p>
+        </w:tc>
+        <w:tc>
+          <w:p>
+            <w:pPr>
+              <w:pStyle w:val="Compact"/>
+              <w:jc w:val="left"/>
+            </w:pPr>
+            <w:r>
+              <w:t xml:space="preserve">p-value</w:t>
+            </w:r>
+          </w:p>
+        </w:tc>
+      </w:tr>
+      <w:tr>
+        <w:tc>
+          <w:p>
+            <w:pPr>
+              <w:pStyle w:val="Compact"/>
+              <w:jc w:val="left"/>
+            </w:pPr>
+            <w:r>
+              <w:t xml:space="preserve">Intercept</w:t>
+            </w:r>
+          </w:p>
+        </w:tc>
+        <w:tc>
+          <w:p>
+            <w:pPr>
+              <w:pStyle w:val="Compact"/>
+              <w:jc w:val="left"/>
+            </w:pPr>
+            <w:r>
+              <w:t xml:space="preserve">4·3406</w:t>
+            </w:r>
+          </w:p>
+        </w:tc>
+        <w:tc>
+          <w:p>
+            <w:pPr>
+              <w:pStyle w:val="Compact"/>
+              <w:jc w:val="left"/>
+            </w:pPr>
+            <w:r>
+              <w:t xml:space="preserve">0·0064</w:t>
+            </w:r>
+          </w:p>
+        </w:tc>
+        <w:tc>
+          <w:p>
+            <w:pPr>
+              <w:pStyle w:val="Compact"/>
+              <w:jc w:val="left"/>
+            </w:pPr>
+            <w:r>
+              <w:t xml:space="preserve">676·85</w:t>
+            </w:r>
+          </w:p>
+        </w:tc>
+        <w:tc>
+          <w:p>
+            <w:pPr>
+              <w:pStyle w:val="Compact"/>
+              <w:jc w:val="left"/>
+            </w:pPr>
+            <w:r>
+              <w:t xml:space="preserve">&lt;0·001</w:t>
+            </w:r>
+          </w:p>
+        </w:tc>
+      </w:tr>
+      <w:tr>
+        <w:tc>
+          <w:p>
+            <w:pPr>
+              <w:pStyle w:val="Compact"/>
+              <w:jc w:val="left"/>
+            </w:pPr>
+            <w:r>
+              <w:t xml:space="preserve">Pre-intervention trend</w:t>
+            </w:r>
+          </w:p>
+        </w:tc>
+        <w:tc>
+          <w:p>
+            <w:pPr>
+              <w:pStyle w:val="Compact"/>
+              <w:jc w:val="left"/>
+            </w:pPr>
+            <w:r>
+              <w:t xml:space="preserve">−0·0299</w:t>
+            </w:r>
+          </w:p>
+        </w:tc>
+        <w:tc>
+          <w:p>
+            <w:pPr>
+              <w:pStyle w:val="Compact"/>
+              <w:jc w:val="left"/>
+            </w:pPr>
+            <w:r>
+              <w:t xml:space="preserve">0·0007</w:t>
+            </w:r>
+          </w:p>
+        </w:tc>
+        <w:tc>
+          <w:p>
+            <w:pPr>
+              <w:pStyle w:val="Compact"/>
+              <w:jc w:val="left"/>
+            </w:pPr>
+            <w:r>
+              <w:t xml:space="preserve">−41·15</w:t>
+            </w:r>
+          </w:p>
+        </w:tc>
+        <w:tc>
+          <w:p>
+            <w:pPr>
+              <w:pStyle w:val="Compact"/>
+              <w:jc w:val="left"/>
+            </w:pPr>
+            <w:r>
+              <w:t xml:space="preserve">&lt;0·001</w:t>
+            </w:r>
+          </w:p>
+        </w:tc>
+      </w:tr>
+      <w:tr>
+        <w:tc>
+          <w:p>
+            <w:pPr>
+              <w:pStyle w:val="Compact"/>
+              <w:jc w:val="left"/>
+            </w:pPr>
+            <w:r>
+              <w:t xml:space="preserve">Level change (Rede Cegonha)</w:t>
+            </w:r>
+          </w:p>
+        </w:tc>
+        <w:tc>
+          <w:p>
+            <w:pPr>
+              <w:pStyle w:val="Compact"/>
+              <w:jc w:val="left"/>
+            </w:pPr>
+            <w:r>
+              <w:t xml:space="preserve">−0·0596</w:t>
+            </w:r>
+          </w:p>
+        </w:tc>
+        <w:tc>
+          <w:p>
+            <w:pPr>
+              <w:pStyle w:val="Compact"/>
+              <w:jc w:val="left"/>
+            </w:pPr>
+            <w:r>
+              <w:t xml:space="preserve">0·0160</w:t>
+            </w:r>
+          </w:p>
+        </w:tc>
+        <w:tc>
+          <w:p>
+            <w:pPr>
+              <w:pStyle w:val="Compact"/>
+              <w:jc w:val="left"/>
+            </w:pPr>
+            <w:r>
+              <w:t xml:space="preserve">−3·72</w:t>
+            </w:r>
+          </w:p>
+        </w:tc>
+        <w:tc>
+          <w:p>
+            <w:pPr>
+              <w:pStyle w:val="Compact"/>
+              <w:jc w:val="left"/>
+            </w:pPr>
+            <w:r>
+              <w:t xml:space="preserve">0·002</w:t>
+            </w:r>
+          </w:p>
+        </w:tc>
+      </w:tr>
+      <w:tr>
+        <w:tc>
+          <w:p>
+            <w:pPr>
+              <w:pStyle w:val="Compact"/>
+              <w:jc w:val="left"/>
+            </w:pPr>
+            <w:r>
+              <w:t xml:space="preserve">Slope change (Rede Cegonha)</w:t>
+            </w:r>
+          </w:p>
+        </w:tc>
+        <w:tc>
+          <w:p>
+            <w:pPr>
+              <w:pStyle w:val="Compact"/>
+              <w:jc w:val="left"/>
+            </w:pPr>
+            <w:r>
+              <w:t xml:space="preserve">0·0390</w:t>
+            </w:r>
+          </w:p>
+        </w:tc>
+        <w:tc>
+          <w:p>
+            <w:pPr>
+              <w:pStyle w:val="Compact"/>
+              <w:jc w:val="left"/>
+            </w:pPr>
+            <w:r>
+              <w:t xml:space="preserve">0·0030</w:t>
+            </w:r>
+          </w:p>
+        </w:tc>
+        <w:tc>
+          <w:p>
+            <w:pPr>
+              <w:pStyle w:val="Compact"/>
+              <w:jc w:val="left"/>
+            </w:pPr>
+            <w:r>
+              <w:t xml:space="preserve">12·78</w:t>
+            </w:r>
+          </w:p>
+        </w:tc>
+        <w:tc>
+          <w:p>
+            <w:pPr>
+              <w:pStyle w:val="Compact"/>
+              <w:jc w:val="left"/>
+            </w:pPr>
+            <w:r>
+              <w:t xml:space="preserve">&lt;0·001</w:t>
+            </w:r>
+          </w:p>
+        </w:tc>
+      </w:tr>
+      <w:tr>
+        <w:tc>
+          <w:p>
+            <w:pPr>
+              <w:pStyle w:val="Compact"/>
+              <w:jc w:val="left"/>
+            </w:pPr>
+            <w:r>
+              <w:t xml:space="preserve">COVID-19 effect (2020–2021)</w:t>
+            </w:r>
+          </w:p>
+        </w:tc>
+        <w:tc>
+          <w:p>
+            <w:pPr>
+              <w:pStyle w:val="Compact"/>
+              <w:jc w:val="left"/>
+            </w:pPr>
+            <w:r>
+              <w:t xml:space="preserve">0·6058</w:t>
+            </w:r>
+          </w:p>
+        </w:tc>
+        <w:tc>
+          <w:p>
+            <w:pPr>
+              <w:pStyle w:val="Compact"/>
+              <w:jc w:val="left"/>
+            </w:pPr>
+            <w:r>
+              <w:t xml:space="preserve">0·1067</w:t>
+            </w:r>
+          </w:p>
+        </w:tc>
+        <w:tc>
+          <w:p>
+            <w:pPr>
+              <w:pStyle w:val="Compact"/>
+              <w:jc w:val="left"/>
+            </w:pPr>
+            <w:r>
+              <w:t xml:space="preserve">5·68</w:t>
+            </w:r>
+          </w:p>
+        </w:tc>
+        <w:tc>
+          <w:p>
+            <w:pPr>
+              <w:pStyle w:val="Compact"/>
+              <w:jc w:val="left"/>
+            </w:pPr>
+            <w:r>
+              <w:t xml:space="preserve">&lt;0·001</w:t>
+            </w:r>
+          </w:p>
+        </w:tc>
+      </w:tr>
+      <w:tr>
+        <w:tc>
+          <w:p>
+            <w:pPr>
+              <w:pStyle w:val="Compact"/>
+              <w:jc w:val="left"/>
+            </w:pPr>
+            <w:r>
+              <w:t xml:space="preserve">Level change (post-COVID)</w:t>
+            </w:r>
+          </w:p>
+        </w:tc>
+        <w:tc>
+          <w:p>
+            <w:pPr>
+              <w:pStyle w:val="Compact"/>
+              <w:jc w:val="left"/>
+            </w:pPr>
+            <w:r>
+              <w:t xml:space="preserve">−0·3232</w:t>
+            </w:r>
+          </w:p>
+        </w:tc>
+        <w:tc>
+          <w:p>
+            <w:pPr>
+              <w:pStyle w:val="Compact"/>
+              <w:jc w:val="left"/>
+            </w:pPr>
+            <w:r>
+              <w:t xml:space="preserve">0·2433</w:t>
+            </w:r>
+          </w:p>
+        </w:tc>
+        <w:tc>
+          <w:p>
+            <w:pPr>
+              <w:pStyle w:val="Compact"/>
+              <w:jc w:val="left"/>
+            </w:pPr>
+            <w:r>
+              <w:t xml:space="preserve">−1·33</w:t>
+            </w:r>
+          </w:p>
+        </w:tc>
+        <w:tc>
+          <w:p>
+            <w:pPr>
+              <w:pStyle w:val="Compact"/>
+              <w:jc w:val="left"/>
+            </w:pPr>
+            <w:r>
+              <w:t xml:space="preserve">0·202</w:t>
+            </w:r>
+          </w:p>
+        </w:tc>
+      </w:tr>
+      <w:tr>
+        <w:tc>
+          <w:p>
+            <w:pPr>
+              <w:pStyle w:val="Compact"/>
+              <w:jc w:val="left"/>
+            </w:pPr>
+            <w:r>
+              <w:t xml:space="preserve">Slope change (post-COVID)</w:t>
+            </w:r>
+          </w:p>
+        </w:tc>
+        <w:tc>
+          <w:p>
+            <w:pPr>
+              <w:pStyle w:val="Compact"/>
+              <w:jc w:val="left"/>
+            </w:pPr>
+            <w:r>
+              <w:t xml:space="preserve">0·1076</w:t>
+            </w:r>
+          </w:p>
+        </w:tc>
+        <w:tc>
+          <w:p>
+            <w:pPr>
+              <w:pStyle w:val="Compact"/>
+              <w:jc w:val="left"/>
+            </w:pPr>
+            <w:r>
+              <w:t xml:space="preserve">0·0689</w:t>
+            </w:r>
+          </w:p>
+        </w:tc>
+        <w:tc>
+          <w:p>
+            <w:pPr>
+              <w:pStyle w:val="Compact"/>
+              <w:jc w:val="left"/>
+            </w:pPr>
+            <w:r>
+              <w:t xml:space="preserve">1·56</w:t>
+            </w:r>
+          </w:p>
+        </w:tc>
+        <w:tc>
+          <w:p>
+            <w:pPr>
+              <w:pStyle w:val="Compact"/>
+              <w:jc w:val="left"/>
+            </w:pPr>
+            <w:r>
+              <w:t xml:space="preserve">0·137</w:t>
+            </w:r>
+          </w:p>
+        </w:tc>
+      </w:tr>
+    </w:tbl>
+    <w:p>
+      <w:pPr>
+        <w:pStyle w:val="BodyText"/>
+      </w:pPr>
+      <w:r>
+        <w:rPr>
+          <w:iCs/>
+          <w:i/>
+        </w:rPr>
+        <w:t xml:space="preserve">SE = standard error with Newey-West correction (lag = 2). Dependent variable: log(MMR).</w:t>
+      </w:r>
+    </w:p>
+    <w:p>
+      <w:pPr>
+        <w:pStyle w:val="CaptionedFigure"/>
+      </w:pPr>
+      <w:r>
+        <w:drawing>
+          <wp:inline>
+            <wp:extent cx="5334000" cy="3200400"/>
+            <wp:effectExtent b="0" l="0" r="0" t="0"/>
+            <wp:docPr descr="Figure 8. Interrupted time-series analysis: fitted model (red) and counterfactual trajectory (blue dashed), Brazil, 2000–2023" title="" id="1" name="Picture"/>
+            <a:graphic>
+              <a:graphicData uri="http://schemas.openxmlformats.org/drawingml/2006/picture">
+                <pic:pic>
+                  <pic:nvPicPr>
+                    <pic:cNvPr descr="resultados/figuras_publicacao/figure8.png" id="0" name="Picture"/>
+                    <pic:cNvPicPr>
+                      <a:picLocks noChangeArrowheads="1" noChangeAspect="1"/>
+                    </pic:cNvPicPr>
+                  </pic:nvPicPr>
+                  <pic:blipFill>
+                    <a:blip r:embed="rId46"/>
+                    <a:stretch>
+                      <a:fillRect/>
+                    </a:stretch>
+                  </pic:blipFill>
+                  <pic:spPr bwMode="auto">
+                    <a:xfrm>
+                      <a:off x="0" y="0"/>
+                      <a:ext cx="5334000" cy="3200400"/>
+                    </a:xfrm>
+                    <a:prstGeom prst="rect">
+                      <a:avLst/>
+                    </a:prstGeom>
+                    <a:noFill/>
+                    <a:ln w="9525">
+                      <a:noFill/>
+                      <a:headEnd/>
+                      <a:tailEnd/>
+                    </a:ln>
+                  </pic:spPr>
+                </pic:pic>
+              </a:graphicData>
+            </a:graphic>
+          </wp:inline>
+        </w:drawing>
+      </w:r>
+    </w:p>
+    <w:p>
+      <w:pPr>
+        <w:pStyle w:val="ImageCaption"/>
+      </w:pPr>
+      <w:r>
+        <w:t xml:space="preserve">Figure 8. Interrupted time-series analysis: fitted model (red) and counterfactual trajectory (blue dashed), Brazil, 2000–2023</w:t>
+      </w:r>
+    </w:p>
+    <w:bookmarkEnd w:id="47"/>
+    <w:bookmarkStart w:id="48" w:name="crude-and-adjusted-models"/>
     <w:p>
       <w:pPr>
         <w:pStyle w:val="Heading3"/>
       </w:pPr>
       <w:r>
+        <w:t xml:space="preserve">Crude and adjusted models</w:t>
+      </w:r>
+    </w:p>
+    <w:p>
+      <w:pPr>
+        <w:pStyle w:val="FirstParagraph"/>
+      </w:pPr>
+      <w:r>
+        <w:rPr>
+          <w:bCs/>
+          <w:b/>
+        </w:rPr>
+        <w:t xml:space="preserve">Table 7. Association between covariates and log(MMR) — crude and adjusted regression models, Brazil, 2000–2023</w:t>
+      </w:r>
+    </w:p>
+    <w:tbl>
+      <w:tblPr>
+        <w:tblStyle w:val="Table"/>
+        <w:tblW w:type="pct" w:w="0.0"/>
+        <w:tblLook w:firstRow="1" w:lastRow="0" w:firstColumn="0" w:lastColumn="0" w:noHBand="0" w:noVBand="0" w:val="0020"/>
+      </w:tblPr>
+      <w:tblGrid/>
+      <w:tr>
+        <w:tc>
+          <w:p>
+            <w:pPr>
+              <w:pStyle w:val="Compact"/>
+              <w:jc w:val="left"/>
+            </w:pPr>
+            <w:r>
+              <w:t xml:space="preserve">Variable</w:t>
+            </w:r>
+          </w:p>
+        </w:tc>
+        <w:tc>
+          <w:p>
+            <w:pPr>
+              <w:pStyle w:val="Compact"/>
+              <w:jc w:val="left"/>
+            </w:pPr>
+            <w:r>
+              <w:t xml:space="preserve">β crude (95% CI)</w:t>
+            </w:r>
+          </w:p>
+        </w:tc>
+        <w:tc>
+          <w:p>
+            <w:pPr>
+              <w:pStyle w:val="Compact"/>
+              <w:jc w:val="left"/>
+            </w:pPr>
+            <w:r>
+              <w:t xml:space="preserve">p (crude)</w:t>
+            </w:r>
+          </w:p>
+        </w:tc>
+        <w:tc>
+          <w:p>
+            <w:pPr>
+              <w:pStyle w:val="Compact"/>
+              <w:jc w:val="left"/>
+            </w:pPr>
+            <w:r>
+              <w:t xml:space="preserve">β adjusted (95% CI)</w:t>
+            </w:r>
+          </w:p>
+        </w:tc>
+        <w:tc>
+          <w:p>
+            <w:pPr>
+              <w:pStyle w:val="Compact"/>
+              <w:jc w:val="left"/>
+            </w:pPr>
+            <w:r>
+              <w:t xml:space="preserve">p (adjusted)</w:t>
+            </w:r>
+          </w:p>
+        </w:tc>
+      </w:tr>
+      <w:tr>
+        <w:tc>
+          <w:p>
+            <w:pPr>
+              <w:pStyle w:val="Compact"/>
+              <w:jc w:val="left"/>
+            </w:pPr>
+            <w:r>
+              <w:t xml:space="preserve">Time trend</w:t>
+            </w:r>
+          </w:p>
+        </w:tc>
+        <w:tc>
+          <w:p>
+            <w:pPr>
+              <w:pStyle w:val="Compact"/>
+              <w:jc w:val="left"/>
+            </w:pPr>
+            <w:r>
+              <w:t xml:space="preserve">−0·0299 (−0·046; −0·014)</w:t>
+            </w:r>
+          </w:p>
+        </w:tc>
+        <w:tc>
+          <w:p>
+            <w:pPr>
+              <w:pStyle w:val="Compact"/>
+              <w:jc w:val="left"/>
+            </w:pPr>
+            <w:r>
+              <w:t xml:space="preserve">&lt;0·001</w:t>
+            </w:r>
+          </w:p>
+        </w:tc>
+        <w:tc>
+          <w:p>
+            <w:pPr>
+              <w:pStyle w:val="Compact"/>
+              <w:jc w:val="left"/>
+            </w:pPr>
+            <w:r>
+              <w:t xml:space="preserve">−0·0320 (−0·051; −0·013)</w:t>
+            </w:r>
+          </w:p>
+        </w:tc>
+        <w:tc>
+          <w:p>
+            <w:pPr>
+              <w:pStyle w:val="Compact"/>
+              <w:jc w:val="left"/>
+            </w:pPr>
+            <w:r>
+              <w:t xml:space="preserve">0·002</w:t>
+            </w:r>
+          </w:p>
+        </w:tc>
+      </w:tr>
+      <w:tr>
+        <w:tc>
+          <w:p>
+            <w:pPr>
+              <w:pStyle w:val="Compact"/>
+              <w:jc w:val="left"/>
+            </w:pPr>
+            <w:r>
+              <w:t xml:space="preserve">Rede Cegonha</w:t>
+            </w:r>
+          </w:p>
+        </w:tc>
+        <w:tc>
+          <w:p>
+            <w:pPr>
+              <w:pStyle w:val="Compact"/>
+              <w:jc w:val="left"/>
+            </w:pPr>
+            <w:r>
+              <w:t xml:space="preserve">−0·0692 (−0·209; 0·071)</w:t>
+            </w:r>
+          </w:p>
+        </w:tc>
+        <w:tc>
+          <w:p>
+            <w:pPr>
+              <w:pStyle w:val="Compact"/>
+              <w:jc w:val="left"/>
+            </w:pPr>
+            <w:r>
+              <w:t xml:space="preserve">0·317</w:t>
+            </w:r>
+          </w:p>
+        </w:tc>
+        <w:tc>
+          <w:p>
+            <w:pPr>
+              <w:pStyle w:val="Compact"/>
+              <w:jc w:val="left"/>
+            </w:pPr>
+            <w:r>
+              <w:t xml:space="preserve">−0·0505 (−0·199; 0·098)</w:t>
+            </w:r>
+          </w:p>
+        </w:tc>
+        <w:tc>
+          <w:p>
+            <w:pPr>
+              <w:pStyle w:val="Compact"/>
+              <w:jc w:val="left"/>
+            </w:pPr>
+            <w:r>
+              <w:t xml:space="preserve">0·482</w:t>
+            </w:r>
+          </w:p>
+        </w:tc>
+      </w:tr>
+      <w:tr>
+        <w:tc>
+          <w:p>
+            <w:pPr>
+              <w:pStyle w:val="Compact"/>
+              <w:jc w:val="left"/>
+            </w:pPr>
+            <w:r>
+              <w:t xml:space="preserve">COVID-19 intensity</w:t>
+            </w:r>
+          </w:p>
+        </w:tc>
+        <w:tc>
+          <w:p>
+            <w:pPr>
+              <w:pStyle w:val="Compact"/>
+              <w:jc w:val="left"/>
+            </w:pPr>
+            <w:r>
+              <w:t xml:space="preserve">0·2805 (0·178; 0·383)</w:t>
+            </w:r>
+          </w:p>
+        </w:tc>
+        <w:tc>
+          <w:p>
+            <w:pPr>
+              <w:pStyle w:val="Compact"/>
+              <w:jc w:val="left"/>
+            </w:pPr>
+            <w:r>
+              <w:t xml:space="preserve">&lt;0·001</w:t>
+            </w:r>
+          </w:p>
+        </w:tc>
+        <w:tc>
+          <w:p>
+            <w:pPr>
+              <w:pStyle w:val="Compact"/>
+              <w:jc w:val="left"/>
+            </w:pPr>
+            <w:r>
+              <w:t xml:space="preserve">0·3694 (0·285; 0·453)</w:t>
+            </w:r>
+          </w:p>
+        </w:tc>
+        <w:tc>
+          <w:p>
+            <w:pPr>
+              <w:pStyle w:val="Compact"/>
+              <w:jc w:val="left"/>
+            </w:pPr>
+            <w:r>
+              <w:t xml:space="preserve">&lt;0·001</w:t>
+            </w:r>
+          </w:p>
+        </w:tc>
+      </w:tr>
+    </w:tbl>
+    <w:p>
+      <w:pPr>
+        <w:pStyle w:val="BodyText"/>
+      </w:pPr>
+      <w:r>
+        <w:rPr>
+          <w:iCs/>
+          <w:i/>
+        </w:rPr>
+        <w:t xml:space="preserve">Adjusted model R² = 0·854. Dependent variable: log(MMR).</w:t>
+      </w:r>
+    </w:p>
+    <w:bookmarkEnd w:id="48"/>
+    <w:bookmarkStart w:id="50" w:name="exploratory-forecasts"/>
+    <w:p>
+      <w:pPr>
+        <w:pStyle w:val="Heading3"/>
+      </w:pPr>
+      <w:r>
         <w:t xml:space="preserve">Exploratory forecasts</w:t>
       </w:r>
     </w:p>
@@ -1030,9 +4267,64 @@
         <w:t xml:space="preserve">The ARIMA model projected an MMR of approximately 64 (95% PI 43–85) for 2024, suggesting stabilisation near pre-pandemic levels. These projections are inertial and do not account for policy changes (figure 9).</w:t>
       </w:r>
     </w:p>
-    <w:bookmarkEnd w:id="39"/>
-    <w:bookmarkEnd w:id="40"/>
-    <w:bookmarkStart w:id="41" w:name="discussion"/>
+    <w:p>
+      <w:pPr>
+        <w:pStyle w:val="CaptionedFigure"/>
+      </w:pPr>
+      <w:r>
+        <w:drawing>
+          <wp:inline>
+            <wp:extent cx="5334000" cy="3200400"/>
+            <wp:effectExtent b="0" l="0" r="0" t="0"/>
+            <wp:docPr descr="Figure 9. Exploratory ARIMA forecast of the maternal mortality ratio, Brazil" title="" id="1" name="Picture"/>
+            <a:graphic>
+              <a:graphicData uri="http://schemas.openxmlformats.org/drawingml/2006/picture">
+                <pic:pic>
+                  <pic:nvPicPr>
+                    <pic:cNvPr descr="resultados/figuras_publicacao/figure9.png" id="0" name="Picture"/>
+                    <pic:cNvPicPr>
+                      <a:picLocks noChangeArrowheads="1" noChangeAspect="1"/>
+                    </pic:cNvPicPr>
+                  </pic:nvPicPr>
+                  <pic:blipFill>
+                    <a:blip r:embed="rId49"/>
+                    <a:stretch>
+                      <a:fillRect/>
+                    </a:stretch>
+                  </pic:blipFill>
+                  <pic:spPr bwMode="auto">
+                    <a:xfrm>
+                      <a:off x="0" y="0"/>
+                      <a:ext cx="5334000" cy="3200400"/>
+                    </a:xfrm>
+                    <a:prstGeom prst="rect">
+                      <a:avLst/>
+                    </a:prstGeom>
+                    <a:noFill/>
+                    <a:ln w="9525">
+                      <a:noFill/>
+                      <a:headEnd/>
+                      <a:tailEnd/>
+                    </a:ln>
+                  </pic:spPr>
+                </pic:pic>
+              </a:graphicData>
+            </a:graphic>
+          </wp:inline>
+        </w:drawing>
+      </w:r>
+    </w:p>
+    <w:p>
+      <w:pPr>
+        <w:pStyle w:val="ImageCaption"/>
+      </w:pPr>
+      <w:r>
+        <w:t xml:space="preserve">Figure 9. Exploratory ARIMA forecast of the maternal mortality ratio, Brazil</w:t>
+      </w:r>
+    </w:p>
+    <w:bookmarkEnd w:id="50"/>
+    <w:bookmarkEnd w:id="51"/>
+    <w:bookmarkStart w:id="52" w:name="discussion"/>
     <w:p>
       <w:pPr>
         <w:pStyle w:val="Heading2"/>
@@ -1207,8 +4499,8 @@
         <w:t xml:space="preserve">In conclusion, Brazil’s progress in reducing maternal mortality has stalled since the early 2010s, and the COVID-19 pandemic caused a dramatic but temporary reversal. Deep racial, regional, and socioeconomic inequalities persist. Achieving the SDG target of fewer than 70 maternal deaths per 100 000 livebirths by 2030 will require reinvigorated political commitment, targeted interventions for the most vulnerable populations—particularly Indigenous and Black women—and strengthened emergency obstetric care networks, especially in the North and Northeast regions.</w:t>
       </w:r>
     </w:p>
-    <w:bookmarkEnd w:id="41"/>
-    <w:bookmarkStart w:id="42" w:name="contributors"/>
+    <w:bookmarkEnd w:id="52"/>
+    <w:bookmarkStart w:id="53" w:name="contributors"/>
     <w:p>
       <w:pPr>
         <w:pStyle w:val="Heading2"/>
@@ -1225,8 +4517,8 @@
         <w:t xml:space="preserve">[Author contributions statement following ICMJE criteria]</w:t>
       </w:r>
     </w:p>
-    <w:bookmarkEnd w:id="42"/>
-    <w:bookmarkStart w:id="43" w:name="declaration-of-interests"/>
+    <w:bookmarkEnd w:id="53"/>
+    <w:bookmarkStart w:id="54" w:name="declaration-of-interests"/>
     <w:p>
       <w:pPr>
         <w:pStyle w:val="Heading2"/>
@@ -1243,8 +4535,8 @@
         <w:t xml:space="preserve">We declare no competing interests.</w:t>
       </w:r>
     </w:p>
-    <w:bookmarkEnd w:id="43"/>
-    <w:bookmarkStart w:id="44" w:name="data-sharing"/>
+    <w:bookmarkEnd w:id="54"/>
+    <w:bookmarkStart w:id="55" w:name="data-sharing"/>
     <w:p>
       <w:pPr>
         <w:pStyle w:val="Heading2"/>
@@ -1261,8 +4553,8 @@
         <w:t xml:space="preserve">All data used in this study are publicly available from the DATASUS platform (https://datasus.saude.gov.br/). Analytical code is available at [repository URL].</w:t>
       </w:r>
     </w:p>
-    <w:bookmarkEnd w:id="44"/>
-    <w:bookmarkStart w:id="45" w:name="acknowledgments"/>
+    <w:bookmarkEnd w:id="55"/>
+    <w:bookmarkStart w:id="56" w:name="acknowledgments"/>
     <w:p>
       <w:pPr>
         <w:pStyle w:val="Heading2"/>
@@ -1291,8 +4583,8 @@
         </w:pict>
       </w:r>
     </w:p>
-    <w:bookmarkEnd w:id="45"/>
-    <w:bookmarkStart w:id="46" w:name="references"/>
+    <w:bookmarkEnd w:id="56"/>
+    <w:bookmarkStart w:id="57" w:name="references"/>
     <w:p>
       <w:pPr>
         <w:pStyle w:val="Heading2"/>
@@ -1726,8 +5018,8 @@
         </w:pict>
       </w:r>
     </w:p>
-    <w:bookmarkEnd w:id="46"/>
-    <w:bookmarkStart w:id="47" w:name="figure-legends"/>
+    <w:bookmarkEnd w:id="57"/>
+    <w:bookmarkStart w:id="58" w:name="figure-legends"/>
     <w:p>
       <w:pPr>
         <w:pStyle w:val="Heading2"/>
@@ -1905,14 +5197,23 @@
         </w:pict>
       </w:r>
     </w:p>
-    <w:bookmarkEnd w:id="47"/>
-    <w:bookmarkStart w:id="48" w:name="supplementary-appendix"/>
+    <w:bookmarkEnd w:id="58"/>
+    <w:bookmarkStart w:id="66" w:name="supplementary-appendix"/>
     <w:p>
       <w:pPr>
         <w:pStyle w:val="Heading2"/>
       </w:pPr>
       <w:r>
-        <w:t xml:space="preserve">Supplementary appendix</w:t>
+        <w:t xml:space="preserve">Supplementary Appendix</w:t>
+      </w:r>
+    </w:p>
+    <w:bookmarkStart w:id="59" w:name="X688cb071a41d0b805e807c6420a9f05cd893cdd"/>
+    <w:p>
+      <w:pPr>
+        <w:pStyle w:val="Heading3"/>
+      </w:pPr>
+      <w:r>
+        <w:t xml:space="preserve">Table S1. Mean MMR by federative unit and period, Brazil, 2000–2023 (per 100 000 livebirths)</w:t>
       </w:r>
     </w:p>
     <w:p>
@@ -1920,25 +5221,1117 @@
         <w:pStyle w:val="FirstParagraph"/>
       </w:pPr>
       <w:r>
-        <w:t xml:space="preserve">Available online with the full text of this article at [journal website].</w:t>
-      </w:r>
-    </w:p>
+        <w:rPr>
+          <w:iCs/>
+          <w:i/>
+        </w:rPr>
+        <w:t xml:space="preserve">See supplementary Excel file (tabela_S1_uf_periodo.html) for the complete 27-state table. A selection of key states is shown below:</w:t>
+      </w:r>
+    </w:p>
+    <w:tbl>
+      <w:tblPr>
+        <w:tblStyle w:val="Table"/>
+        <w:tblW w:type="pct" w:w="0.0"/>
+        <w:tblLook w:firstRow="1" w:lastRow="0" w:firstColumn="0" w:lastColumn="0" w:noHBand="0" w:noVBand="0" w:val="0020"/>
+      </w:tblPr>
+      <w:tblGrid/>
+      <w:tr>
+        <w:tc>
+          <w:p>
+            <w:pPr>
+              <w:pStyle w:val="Compact"/>
+              <w:jc w:val="left"/>
+            </w:pPr>
+            <w:r>
+              <w:t xml:space="preserve">State</w:t>
+            </w:r>
+          </w:p>
+        </w:tc>
+        <w:tc>
+          <w:p>
+            <w:pPr>
+              <w:pStyle w:val="Compact"/>
+              <w:jc w:val="left"/>
+            </w:pPr>
+            <w:r>
+              <w:t xml:space="preserve">Region</w:t>
+            </w:r>
+          </w:p>
+        </w:tc>
+        <w:tc>
+          <w:p>
+            <w:pPr>
+              <w:pStyle w:val="Compact"/>
+              <w:jc w:val="left"/>
+            </w:pPr>
+            <w:r>
+              <w:t xml:space="preserve">2000–2010</w:t>
+            </w:r>
+          </w:p>
+        </w:tc>
+        <w:tc>
+          <w:p>
+            <w:pPr>
+              <w:pStyle w:val="Compact"/>
+              <w:jc w:val="left"/>
+            </w:pPr>
+            <w:r>
+              <w:t xml:space="preserve">2011–2019</w:t>
+            </w:r>
+          </w:p>
+        </w:tc>
+        <w:tc>
+          <w:p>
+            <w:pPr>
+              <w:pStyle w:val="Compact"/>
+              <w:jc w:val="left"/>
+            </w:pPr>
+            <w:r>
+              <w:t xml:space="preserve">2020–2021</w:t>
+            </w:r>
+          </w:p>
+        </w:tc>
+        <w:tc>
+          <w:p>
+            <w:pPr>
+              <w:pStyle w:val="Compact"/>
+              <w:jc w:val="left"/>
+            </w:pPr>
+            <w:r>
+              <w:t xml:space="preserve">2022–2023</w:t>
+            </w:r>
+          </w:p>
+        </w:tc>
+      </w:tr>
+      <w:tr>
+        <w:tc>
+          <w:p>
+            <w:pPr>
+              <w:pStyle w:val="Compact"/>
+              <w:jc w:val="left"/>
+            </w:pPr>
+            <w:r>
+              <w:t xml:space="preserve">PA</w:t>
+            </w:r>
+          </w:p>
+        </w:tc>
+        <w:tc>
+          <w:p>
+            <w:pPr>
+              <w:pStyle w:val="Compact"/>
+              <w:jc w:val="left"/>
+            </w:pPr>
+            <w:r>
+              <w:t xml:space="preserve">North</w:t>
+            </w:r>
+          </w:p>
+        </w:tc>
+        <w:tc>
+          <w:p>
+            <w:pPr>
+              <w:pStyle w:val="Compact"/>
+              <w:jc w:val="left"/>
+            </w:pPr>
+            <w:r>
+              <w:t xml:space="preserve">91·2</w:t>
+            </w:r>
+          </w:p>
+        </w:tc>
+        <w:tc>
+          <w:p>
+            <w:pPr>
+              <w:pStyle w:val="Compact"/>
+              <w:jc w:val="left"/>
+            </w:pPr>
+            <w:r>
+              <w:t xml:space="preserve">78·4</w:t>
+            </w:r>
+          </w:p>
+        </w:tc>
+        <w:tc>
+          <w:p>
+            <w:pPr>
+              <w:pStyle w:val="Compact"/>
+              <w:jc w:val="left"/>
+            </w:pPr>
+            <w:r>
+              <w:t xml:space="preserve">132·5</w:t>
+            </w:r>
+          </w:p>
+        </w:tc>
+        <w:tc>
+          <w:p>
+            <w:pPr>
+              <w:pStyle w:val="Compact"/>
+              <w:jc w:val="left"/>
+            </w:pPr>
+            <w:r>
+              <w:t xml:space="preserve">82·1</w:t>
+            </w:r>
+          </w:p>
+        </w:tc>
+      </w:tr>
+      <w:tr>
+        <w:tc>
+          <w:p>
+            <w:pPr>
+              <w:pStyle w:val="Compact"/>
+              <w:jc w:val="left"/>
+            </w:pPr>
+            <w:r>
+              <w:t xml:space="preserve">AM</w:t>
+            </w:r>
+          </w:p>
+        </w:tc>
+        <w:tc>
+          <w:p>
+            <w:pPr>
+              <w:pStyle w:val="Compact"/>
+              <w:jc w:val="left"/>
+            </w:pPr>
+            <w:r>
+              <w:t xml:space="preserve">North</w:t>
+            </w:r>
+          </w:p>
+        </w:tc>
+        <w:tc>
+          <w:p>
+            <w:pPr>
+              <w:pStyle w:val="Compact"/>
+              <w:jc w:val="left"/>
+            </w:pPr>
+            <w:r>
+              <w:t xml:space="preserve">88·7</w:t>
+            </w:r>
+          </w:p>
+        </w:tc>
+        <w:tc>
+          <w:p>
+            <w:pPr>
+              <w:pStyle w:val="Compact"/>
+              <w:jc w:val="left"/>
+            </w:pPr>
+            <w:r>
+              <w:t xml:space="preserve">76·9</w:t>
+            </w:r>
+          </w:p>
+        </w:tc>
+        <w:tc>
+          <w:p>
+            <w:pPr>
+              <w:pStyle w:val="Compact"/>
+              <w:jc w:val="left"/>
+            </w:pPr>
+            <w:r>
+              <w:t xml:space="preserve">128·3</w:t>
+            </w:r>
+          </w:p>
+        </w:tc>
+        <w:tc>
+          <w:p>
+            <w:pPr>
+              <w:pStyle w:val="Compact"/>
+              <w:jc w:val="left"/>
+            </w:pPr>
+            <w:r>
+              <w:t xml:space="preserve">80·5</w:t>
+            </w:r>
+          </w:p>
+        </w:tc>
+      </w:tr>
+      <w:tr>
+        <w:tc>
+          <w:p>
+            <w:pPr>
+              <w:pStyle w:val="Compact"/>
+              <w:jc w:val="left"/>
+            </w:pPr>
+            <w:r>
+              <w:t xml:space="preserve">BA</w:t>
+            </w:r>
+          </w:p>
+        </w:tc>
+        <w:tc>
+          <w:p>
+            <w:pPr>
+              <w:pStyle w:val="Compact"/>
+              <w:jc w:val="left"/>
+            </w:pPr>
+            <w:r>
+              <w:t xml:space="preserve">Northeast</w:t>
+            </w:r>
+          </w:p>
+        </w:tc>
+        <w:tc>
+          <w:p>
+            <w:pPr>
+              <w:pStyle w:val="Compact"/>
+              <w:jc w:val="left"/>
+            </w:pPr>
+            <w:r>
+              <w:t xml:space="preserve">74·8</w:t>
+            </w:r>
+          </w:p>
+        </w:tc>
+        <w:tc>
+          <w:p>
+            <w:pPr>
+              <w:pStyle w:val="Compact"/>
+              <w:jc w:val="left"/>
+            </w:pPr>
+            <w:r>
+              <w:t xml:space="preserve">65·2</w:t>
+            </w:r>
+          </w:p>
+        </w:tc>
+        <w:tc>
+          <w:p>
+            <w:pPr>
+              <w:pStyle w:val="Compact"/>
+              <w:jc w:val="left"/>
+            </w:pPr>
+            <w:r>
+              <w:t xml:space="preserve">106·1</w:t>
+            </w:r>
+          </w:p>
+        </w:tc>
+        <w:tc>
+          <w:p>
+            <w:pPr>
+              <w:pStyle w:val="Compact"/>
+              <w:jc w:val="left"/>
+            </w:pPr>
+            <w:r>
+              <w:t xml:space="preserve">68·9</w:t>
+            </w:r>
+          </w:p>
+        </w:tc>
+      </w:tr>
+      <w:tr>
+        <w:tc>
+          <w:p>
+            <w:pPr>
+              <w:pStyle w:val="Compact"/>
+              <w:jc w:val="left"/>
+            </w:pPr>
+            <w:r>
+              <w:t xml:space="preserve">CE</w:t>
+            </w:r>
+          </w:p>
+        </w:tc>
+        <w:tc>
+          <w:p>
+            <w:pPr>
+              <w:pStyle w:val="Compact"/>
+              <w:jc w:val="left"/>
+            </w:pPr>
+            <w:r>
+              <w:t xml:space="preserve">Northeast</w:t>
+            </w:r>
+          </w:p>
+        </w:tc>
+        <w:tc>
+          <w:p>
+            <w:pPr>
+              <w:pStyle w:val="Compact"/>
+              <w:jc w:val="left"/>
+            </w:pPr>
+            <w:r>
+              <w:t xml:space="preserve">78·3</w:t>
+            </w:r>
+          </w:p>
+        </w:tc>
+        <w:tc>
+          <w:p>
+            <w:pPr>
+              <w:pStyle w:val="Compact"/>
+              <w:jc w:val="left"/>
+            </w:pPr>
+            <w:r>
+              <w:t xml:space="preserve">67·5</w:t>
+            </w:r>
+          </w:p>
+        </w:tc>
+        <w:tc>
+          <w:p>
+            <w:pPr>
+              <w:pStyle w:val="Compact"/>
+              <w:jc w:val="left"/>
+            </w:pPr>
+            <w:r>
+              <w:t xml:space="preserve">111·2</w:t>
+            </w:r>
+          </w:p>
+        </w:tc>
+        <w:tc>
+          <w:p>
+            <w:pPr>
+              <w:pStyle w:val="Compact"/>
+              <w:jc w:val="left"/>
+            </w:pPr>
+            <w:r>
+              <w:t xml:space="preserve">70·8</w:t>
+            </w:r>
+          </w:p>
+        </w:tc>
+      </w:tr>
+      <w:tr>
+        <w:tc>
+          <w:p>
+            <w:pPr>
+              <w:pStyle w:val="Compact"/>
+              <w:jc w:val="left"/>
+            </w:pPr>
+            <w:r>
+              <w:t xml:space="preserve">MG</w:t>
+            </w:r>
+          </w:p>
+        </w:tc>
+        <w:tc>
+          <w:p>
+            <w:pPr>
+              <w:pStyle w:val="Compact"/>
+              <w:jc w:val="left"/>
+            </w:pPr>
+            <w:r>
+              <w:t xml:space="preserve">Southeast</w:t>
+            </w:r>
+          </w:p>
+        </w:tc>
+        <w:tc>
+          <w:p>
+            <w:pPr>
+              <w:pStyle w:val="Compact"/>
+              <w:jc w:val="left"/>
+            </w:pPr>
+            <w:r>
+              <w:t xml:space="preserve">52·1</w:t>
+            </w:r>
+          </w:p>
+        </w:tc>
+        <w:tc>
+          <w:p>
+            <w:pPr>
+              <w:pStyle w:val="Compact"/>
+              <w:jc w:val="left"/>
+            </w:pPr>
+            <w:r>
+              <w:t xml:space="preserve">45·3</w:t>
+            </w:r>
+          </w:p>
+        </w:tc>
+        <w:tc>
+          <w:p>
+            <w:pPr>
+              <w:pStyle w:val="Compact"/>
+              <w:jc w:val="left"/>
+            </w:pPr>
+            <w:r>
+              <w:t xml:space="preserve">73·6</w:t>
+            </w:r>
+          </w:p>
+        </w:tc>
+        <w:tc>
+          <w:p>
+            <w:pPr>
+              <w:pStyle w:val="Compact"/>
+              <w:jc w:val="left"/>
+            </w:pPr>
+            <w:r>
+              <w:t xml:space="preserve">47·6</w:t>
+            </w:r>
+          </w:p>
+        </w:tc>
+      </w:tr>
+      <w:tr>
+        <w:tc>
+          <w:p>
+            <w:pPr>
+              <w:pStyle w:val="Compact"/>
+              <w:jc w:val="left"/>
+            </w:pPr>
+            <w:r>
+              <w:t xml:space="preserve">SP</w:t>
+            </w:r>
+          </w:p>
+        </w:tc>
+        <w:tc>
+          <w:p>
+            <w:pPr>
+              <w:pStyle w:val="Compact"/>
+              <w:jc w:val="left"/>
+            </w:pPr>
+            <w:r>
+              <w:t xml:space="preserve">Southeast</w:t>
+            </w:r>
+          </w:p>
+        </w:tc>
+        <w:tc>
+          <w:p>
+            <w:pPr>
+              <w:pStyle w:val="Compact"/>
+              <w:jc w:val="left"/>
+            </w:pPr>
+            <w:r>
+              <w:t xml:space="preserve">48·9</w:t>
+            </w:r>
+          </w:p>
+        </w:tc>
+        <w:tc>
+          <w:p>
+            <w:pPr>
+              <w:pStyle w:val="Compact"/>
+              <w:jc w:val="left"/>
+            </w:pPr>
+            <w:r>
+              <w:t xml:space="preserve">42·5</w:t>
+            </w:r>
+          </w:p>
+        </w:tc>
+        <w:tc>
+          <w:p>
+            <w:pPr>
+              <w:pStyle w:val="Compact"/>
+              <w:jc w:val="left"/>
+            </w:pPr>
+            <w:r>
+              <w:t xml:space="preserve">69·2</w:t>
+            </w:r>
+          </w:p>
+        </w:tc>
+        <w:tc>
+          <w:p>
+            <w:pPr>
+              <w:pStyle w:val="Compact"/>
+              <w:jc w:val="left"/>
+            </w:pPr>
+            <w:r>
+              <w:t xml:space="preserve">44·8</w:t>
+            </w:r>
+          </w:p>
+        </w:tc>
+      </w:tr>
+      <w:tr>
+        <w:tc>
+          <w:p>
+            <w:pPr>
+              <w:pStyle w:val="Compact"/>
+              <w:jc w:val="left"/>
+            </w:pPr>
+            <w:r>
+              <w:t xml:space="preserve">RJ</w:t>
+            </w:r>
+          </w:p>
+        </w:tc>
+        <w:tc>
+          <w:p>
+            <w:pPr>
+              <w:pStyle w:val="Compact"/>
+              <w:jc w:val="left"/>
+            </w:pPr>
+            <w:r>
+              <w:t xml:space="preserve">Southeast</w:t>
+            </w:r>
+          </w:p>
+        </w:tc>
+        <w:tc>
+          <w:p>
+            <w:pPr>
+              <w:pStyle w:val="Compact"/>
+              <w:jc w:val="left"/>
+            </w:pPr>
+            <w:r>
+              <w:t xml:space="preserve">62·3</w:t>
+            </w:r>
+          </w:p>
+        </w:tc>
+        <w:tc>
+          <w:p>
+            <w:pPr>
+              <w:pStyle w:val="Compact"/>
+              <w:jc w:val="left"/>
+            </w:pPr>
+            <w:r>
+              <w:t xml:space="preserve">54·1</w:t>
+            </w:r>
+          </w:p>
+        </w:tc>
+        <w:tc>
+          <w:p>
+            <w:pPr>
+              <w:pStyle w:val="Compact"/>
+              <w:jc w:val="left"/>
+            </w:pPr>
+            <w:r>
+              <w:t xml:space="preserve">88·7</w:t>
+            </w:r>
+          </w:p>
+        </w:tc>
+        <w:tc>
+          <w:p>
+            <w:pPr>
+              <w:pStyle w:val="Compact"/>
+              <w:jc w:val="left"/>
+            </w:pPr>
+            <w:r>
+              <w:t xml:space="preserve">56·4</w:t>
+            </w:r>
+          </w:p>
+        </w:tc>
+      </w:tr>
+      <w:tr>
+        <w:tc>
+          <w:p>
+            <w:pPr>
+              <w:pStyle w:val="Compact"/>
+              <w:jc w:val="left"/>
+            </w:pPr>
+            <w:r>
+              <w:t xml:space="preserve">PR</w:t>
+            </w:r>
+          </w:p>
+        </w:tc>
+        <w:tc>
+          <w:p>
+            <w:pPr>
+              <w:pStyle w:val="Compact"/>
+              <w:jc w:val="left"/>
+            </w:pPr>
+            <w:r>
+              <w:t xml:space="preserve">South</w:t>
+            </w:r>
+          </w:p>
+        </w:tc>
+        <w:tc>
+          <w:p>
+            <w:pPr>
+              <w:pStyle w:val="Compact"/>
+              <w:jc w:val="left"/>
+            </w:pPr>
+            <w:r>
+              <w:t xml:space="preserve">49·2</w:t>
+            </w:r>
+          </w:p>
+        </w:tc>
+        <w:tc>
+          <w:p>
+            <w:pPr>
+              <w:pStyle w:val="Compact"/>
+              <w:jc w:val="left"/>
+            </w:pPr>
+            <w:r>
+              <w:t xml:space="preserve">42·8</w:t>
+            </w:r>
+          </w:p>
+        </w:tc>
+        <w:tc>
+          <w:p>
+            <w:pPr>
+              <w:pStyle w:val="Compact"/>
+              <w:jc w:val="left"/>
+            </w:pPr>
+            <w:r>
+              <w:t xml:space="preserve">69·5</w:t>
+            </w:r>
+          </w:p>
+        </w:tc>
+        <w:tc>
+          <w:p>
+            <w:pPr>
+              <w:pStyle w:val="Compact"/>
+              <w:jc w:val="left"/>
+            </w:pPr>
+            <w:r>
+              <w:t xml:space="preserve">45·1</w:t>
+            </w:r>
+          </w:p>
+        </w:tc>
+      </w:tr>
+      <w:tr>
+        <w:tc>
+          <w:p>
+            <w:pPr>
+              <w:pStyle w:val="Compact"/>
+              <w:jc w:val="left"/>
+            </w:pPr>
+            <w:r>
+              <w:t xml:space="preserve">RS</w:t>
+            </w:r>
+          </w:p>
+        </w:tc>
+        <w:tc>
+          <w:p>
+            <w:pPr>
+              <w:pStyle w:val="Compact"/>
+              <w:jc w:val="left"/>
+            </w:pPr>
+            <w:r>
+              <w:t xml:space="preserve">South</w:t>
+            </w:r>
+          </w:p>
+        </w:tc>
+        <w:tc>
+          <w:p>
+            <w:pPr>
+              <w:pStyle w:val="Compact"/>
+              <w:jc w:val="left"/>
+            </w:pPr>
+            <w:r>
+              <w:t xml:space="preserve">45·6</w:t>
+            </w:r>
+          </w:p>
+        </w:tc>
+        <w:tc>
+          <w:p>
+            <w:pPr>
+              <w:pStyle w:val="Compact"/>
+              <w:jc w:val="left"/>
+            </w:pPr>
+            <w:r>
+              <w:t xml:space="preserve">39·7</w:t>
+            </w:r>
+          </w:p>
+        </w:tc>
+        <w:tc>
+          <w:p>
+            <w:pPr>
+              <w:pStyle w:val="Compact"/>
+              <w:jc w:val="left"/>
+            </w:pPr>
+            <w:r>
+              <w:t xml:space="preserve">64·8</w:t>
+            </w:r>
+          </w:p>
+        </w:tc>
+        <w:tc>
+          <w:p>
+            <w:pPr>
+              <w:pStyle w:val="Compact"/>
+              <w:jc w:val="left"/>
+            </w:pPr>
+            <w:r>
+              <w:t xml:space="preserve">41·8</w:t>
+            </w:r>
+          </w:p>
+        </w:tc>
+      </w:tr>
+      <w:tr>
+        <w:tc>
+          <w:p>
+            <w:pPr>
+              <w:pStyle w:val="Compact"/>
+              <w:jc w:val="left"/>
+            </w:pPr>
+            <w:r>
+              <w:t xml:space="preserve">GO</w:t>
+            </w:r>
+          </w:p>
+        </w:tc>
+        <w:tc>
+          <w:p>
+            <w:pPr>
+              <w:pStyle w:val="Compact"/>
+              <w:jc w:val="left"/>
+            </w:pPr>
+            <w:r>
+              <w:t xml:space="preserve">Central-West</w:t>
+            </w:r>
+          </w:p>
+        </w:tc>
+        <w:tc>
+          <w:p>
+            <w:pPr>
+              <w:pStyle w:val="Compact"/>
+              <w:jc w:val="left"/>
+            </w:pPr>
+            <w:r>
+              <w:t xml:space="preserve">55·1</w:t>
+            </w:r>
+          </w:p>
+        </w:tc>
+        <w:tc>
+          <w:p>
+            <w:pPr>
+              <w:pStyle w:val="Compact"/>
+              <w:jc w:val="left"/>
+            </w:pPr>
+            <w:r>
+              <w:t xml:space="preserve">47·9</w:t>
+            </w:r>
+          </w:p>
+        </w:tc>
+        <w:tc>
+          <w:p>
+            <w:pPr>
+              <w:pStyle w:val="Compact"/>
+              <w:jc w:val="left"/>
+            </w:pPr>
+            <w:r>
+              <w:t xml:space="preserve">78·3</w:t>
+            </w:r>
+          </w:p>
+        </w:tc>
+        <w:tc>
+          <w:p>
+            <w:pPr>
+              <w:pStyle w:val="Compact"/>
+              <w:jc w:val="left"/>
+            </w:pPr>
+            <w:r>
+              <w:t xml:space="preserve">50·6</w:t>
+            </w:r>
+          </w:p>
+        </w:tc>
+      </w:tr>
+    </w:tbl>
+    <w:bookmarkEnd w:id="59"/>
+    <w:bookmarkStart w:id="60" w:name="X0e10fd85de9035753d0fd3dcd5685a1c2e18734"/>
+    <w:p>
+      <w:pPr>
+        <w:pStyle w:val="Heading3"/>
+      </w:pPr>
+      <w:r>
+        <w:t xml:space="preserve">Table S2. Annual percentage change (APC) of the MMR by federative unit — Prais-Winsten regression, Brazil, 2000–2023</w:t>
+      </w:r>
+    </w:p>
+    <w:p>
+      <w:pPr>
+        <w:pStyle w:val="FirstParagraph"/>
+      </w:pPr>
+      <w:r>
+        <w:rPr>
+          <w:iCs/>
+          <w:i/>
+        </w:rPr>
+        <w:t xml:space="preserve">See supplementary file (tabela_S2_pw_uf.html) for all 27 states. Results are grouped by region.</w:t>
+      </w:r>
+    </w:p>
+    <w:bookmarkEnd w:id="60"/>
+    <w:bookmarkStart w:id="61" w:name="X0962b33cb93c3ec92509987486d5c4a9c0e6444"/>
+    <w:p>
+      <w:pPr>
+        <w:pStyle w:val="Heading3"/>
+      </w:pPr>
+      <w:r>
+        <w:t xml:space="preserve">Table S3. Diagnostic tests for the interrupted time-series model</w:t>
+      </w:r>
+    </w:p>
+    <w:tbl>
+      <w:tblPr>
+        <w:tblStyle w:val="Table"/>
+        <w:tblW w:type="pct" w:w="0.0"/>
+        <w:tblLook w:firstRow="1" w:lastRow="0" w:firstColumn="0" w:lastColumn="0" w:noHBand="0" w:noVBand="0" w:val="0020"/>
+      </w:tblPr>
+      <w:tblGrid/>
+      <w:tr>
+        <w:tc>
+          <w:p>
+            <w:pPr>
+              <w:pStyle w:val="Compact"/>
+              <w:jc w:val="left"/>
+            </w:pPr>
+            <w:r>
+              <w:t xml:space="preserve">Test</w:t>
+            </w:r>
+          </w:p>
+        </w:tc>
+        <w:tc>
+          <w:p>
+            <w:pPr>
+              <w:pStyle w:val="Compact"/>
+              <w:jc w:val="left"/>
+            </w:pPr>
+            <w:r>
+              <w:t xml:space="preserve">Value</w:t>
+            </w:r>
+          </w:p>
+        </w:tc>
+      </w:tr>
+      <w:tr>
+        <w:tc>
+          <w:p>
+            <w:pPr>
+              <w:pStyle w:val="Compact"/>
+              <w:jc w:val="left"/>
+            </w:pPr>
+            <w:r>
+              <w:t xml:space="preserve">Durbin-Watson statistic</w:t>
+            </w:r>
+          </w:p>
+        </w:tc>
+        <w:tc>
+          <w:p>
+            <w:pPr>
+              <w:pStyle w:val="Compact"/>
+              <w:jc w:val="left"/>
+            </w:pPr>
+            <w:r>
+              <w:t xml:space="preserve">2·134</w:t>
+            </w:r>
+          </w:p>
+        </w:tc>
+      </w:tr>
+      <w:tr>
+        <w:tc>
+          <w:p>
+            <w:pPr>
+              <w:pStyle w:val="Compact"/>
+              <w:jc w:val="left"/>
+            </w:pPr>
+            <w:r>
+              <w:t xml:space="preserve">R²</w:t>
+            </w:r>
+          </w:p>
+        </w:tc>
+        <w:tc>
+          <w:p>
+            <w:pPr>
+              <w:pStyle w:val="Compact"/>
+              <w:jc w:val="left"/>
+            </w:pPr>
+            <w:r>
+              <w:t xml:space="preserve">0·928</w:t>
+            </w:r>
+          </w:p>
+        </w:tc>
+      </w:tr>
+      <w:tr>
+        <w:tc>
+          <w:p>
+            <w:pPr>
+              <w:pStyle w:val="Compact"/>
+              <w:jc w:val="left"/>
+            </w:pPr>
+            <w:r>
+              <w:t xml:space="preserve">Adjusted R²</w:t>
+            </w:r>
+          </w:p>
+        </w:tc>
+        <w:tc>
+          <w:p>
+            <w:pPr>
+              <w:pStyle w:val="Compact"/>
+              <w:jc w:val="left"/>
+            </w:pPr>
+            <w:r>
+              <w:t xml:space="preserve">0·903</w:t>
+            </w:r>
+          </w:p>
+        </w:tc>
+      </w:tr>
+      <w:tr>
+        <w:tc>
+          <w:p>
+            <w:pPr>
+              <w:pStyle w:val="Compact"/>
+              <w:jc w:val="left"/>
+            </w:pPr>
+            <w:r>
+              <w:t xml:space="preserve">AIC</w:t>
+            </w:r>
+          </w:p>
+        </w:tc>
+        <w:tc>
+          <w:p>
+            <w:pPr>
+              <w:pStyle w:val="Compact"/>
+              <w:jc w:val="left"/>
+            </w:pPr>
+            <w:r>
+              <w:t xml:space="preserve">−52·31</w:t>
+            </w:r>
+          </w:p>
+        </w:tc>
+      </w:tr>
+      <w:tr>
+        <w:tc>
+          <w:p>
+            <w:pPr>
+              <w:pStyle w:val="Compact"/>
+              <w:jc w:val="left"/>
+            </w:pPr>
+            <w:r>
+              <w:t xml:space="preserve">BIC</w:t>
+            </w:r>
+          </w:p>
+        </w:tc>
+        <w:tc>
+          <w:p>
+            <w:pPr>
+              <w:pStyle w:val="Compact"/>
+              <w:jc w:val="left"/>
+            </w:pPr>
+            <w:r>
+              <w:t xml:space="preserve">−43·75</w:t>
+            </w:r>
+          </w:p>
+        </w:tc>
+      </w:tr>
+      <w:tr>
+        <w:tc>
+          <w:p>
+            <w:pPr>
+              <w:pStyle w:val="Compact"/>
+              <w:jc w:val="left"/>
+            </w:pPr>
+            <w:r>
+              <w:t xml:space="preserve">Shapiro-Wilk (residuals) p-value</w:t>
+            </w:r>
+          </w:p>
+        </w:tc>
+        <w:tc>
+          <w:p>
+            <w:pPr>
+              <w:pStyle w:val="Compact"/>
+              <w:jc w:val="left"/>
+            </w:pPr>
+            <w:r>
+              <w:t xml:space="preserve">0·312</w:t>
+            </w:r>
+          </w:p>
+        </w:tc>
+      </w:tr>
+    </w:tbl>
     <w:p>
       <w:pPr>
         <w:pStyle w:val="BodyText"/>
       </w:pPr>
       <w:r>
         <w:rPr>
-          <w:bCs/>
-          <w:b/>
+          <w:iCs/>
+          <w:i/>
         </w:rPr>
-        <w:t xml:space="preserve">Table S1.</w:t>
-      </w:r>
-      <w:r>
-        <w:t xml:space="preserve"> </w:t>
-      </w:r>
-      <w:r>
-        <w:t xml:space="preserve">Maternal mortality ratio by federative unit and period, Brazil, 2000–2023.</w:t>
+        <w:t xml:space="preserve">Residual normality assumption met (Shapiro-Wilk p &gt; 0·05). Durbin-Watson near 2·0 suggests no remaining autocorrelation after model fitting.</w:t>
+      </w:r>
+    </w:p>
+    <w:bookmarkEnd w:id="61"/>
+    <w:bookmarkStart w:id="63" w:name="X7eea1aa0e239bba3ea653b221e367c9518f6c52"/>
+    <w:p>
+      <w:pPr>
+        <w:pStyle w:val="Heading3"/>
+      </w:pPr>
+      <w:r>
+        <w:t xml:space="preserve">Figure S1. Residual diagnostics for the interrupted time-series model</w:t>
+      </w:r>
+    </w:p>
+    <w:p>
+      <w:pPr>
+        <w:pStyle w:val="CaptionedFigure"/>
+      </w:pPr>
+      <w:r>
+        <w:drawing>
+          <wp:inline>
+            <wp:extent cx="5334000" cy="4267200"/>
+            <wp:effectExtent b="0" l="0" r="0" t="0"/>
+            <wp:docPr descr="Figure S1. Residual diagnostics" title="" id="1" name="Picture"/>
+            <a:graphic>
+              <a:graphicData uri="http://schemas.openxmlformats.org/drawingml/2006/picture">
+                <pic:pic>
+                  <pic:nvPicPr>
+                    <pic:cNvPr descr="resultados/suplementar/fig_S1_diagnostico_residuos.png" id="0" name="Picture"/>
+                    <pic:cNvPicPr>
+                      <a:picLocks noChangeArrowheads="1" noChangeAspect="1"/>
+                    </pic:cNvPicPr>
+                  </pic:nvPicPr>
+                  <pic:blipFill>
+                    <a:blip r:embed="rId62"/>
+                    <a:stretch>
+                      <a:fillRect/>
+                    </a:stretch>
+                  </pic:blipFill>
+                  <pic:spPr bwMode="auto">
+                    <a:xfrm>
+                      <a:off x="0" y="0"/>
+                      <a:ext cx="5334000" cy="4267200"/>
+                    </a:xfrm>
+                    <a:prstGeom prst="rect">
+                      <a:avLst/>
+                    </a:prstGeom>
+                    <a:noFill/>
+                    <a:ln w="9525">
+                      <a:noFill/>
+                      <a:headEnd/>
+                      <a:tailEnd/>
+                    </a:ln>
+                  </pic:spPr>
+                </pic:pic>
+              </a:graphicData>
+            </a:graphic>
+          </wp:inline>
+        </w:drawing>
+      </w:r>
+    </w:p>
+    <w:p>
+      <w:pPr>
+        <w:pStyle w:val="ImageCaption"/>
+      </w:pPr>
+      <w:r>
+        <w:t xml:space="preserve">Figure S1. Residual diagnostics</w:t>
+      </w:r>
+    </w:p>
+    <w:bookmarkEnd w:id="63"/>
+    <w:bookmarkStart w:id="65" w:name="X1d3c7a545a488d825f399f7690412c8464b99a6"/>
+    <w:p>
+      <w:pPr>
+        <w:pStyle w:val="Heading3"/>
+      </w:pPr>
+      <w:r>
+        <w:t xml:space="preserve">Figure S2. Small multiples: MMR trends by federative unit, Brazil, 2000–2023</w:t>
+      </w:r>
+    </w:p>
+    <w:p>
+      <w:pPr>
+        <w:pStyle w:val="CaptionedFigure"/>
+      </w:pPr>
+      <w:r>
+        <w:drawing>
+          <wp:inline>
+            <wp:extent cx="5334000" cy="4572000"/>
+            <wp:effectExtent b="0" l="0" r="0" t="0"/>
+            <wp:docPr descr="Figure S2. MMR by federative unit — small multiples" title="" id="1" name="Picture"/>
+            <a:graphic>
+              <a:graphicData uri="http://schemas.openxmlformats.org/drawingml/2006/picture">
+                <pic:pic>
+                  <pic:nvPicPr>
+                    <pic:cNvPr descr="resultados/suplementar/fig_S2_pequenos_multiplos_uf.png" id="0" name="Picture"/>
+                    <pic:cNvPicPr>
+                      <a:picLocks noChangeArrowheads="1" noChangeAspect="1"/>
+                    </pic:cNvPicPr>
+                  </pic:nvPicPr>
+                  <pic:blipFill>
+                    <a:blip r:embed="rId64"/>
+                    <a:stretch>
+                      <a:fillRect/>
+                    </a:stretch>
+                  </pic:blipFill>
+                  <pic:spPr bwMode="auto">
+                    <a:xfrm>
+                      <a:off x="0" y="0"/>
+                      <a:ext cx="5334000" cy="4572000"/>
+                    </a:xfrm>
+                    <a:prstGeom prst="rect">
+                      <a:avLst/>
+                    </a:prstGeom>
+                    <a:noFill/>
+                    <a:ln w="9525">
+                      <a:noFill/>
+                      <a:headEnd/>
+                      <a:tailEnd/>
+                    </a:ln>
+                  </pic:spPr>
+                </pic:pic>
+              </a:graphicData>
+            </a:graphic>
+          </wp:inline>
+        </w:drawing>
+      </w:r>
+    </w:p>
+    <w:p>
+      <w:pPr>
+        <w:pStyle w:val="ImageCaption"/>
+      </w:pPr>
+      <w:r>
+        <w:t xml:space="preserve">Figure S2. MMR by federative unit — small multiples</w:t>
       </w:r>
     </w:p>
     <w:p>
@@ -1947,74 +6340,15 @@
       </w:pPr>
       <w:r>
         <w:rPr>
-          <w:bCs/>
-          <w:b/>
+          <w:iCs/>
+          <w:i/>
         </w:rPr>
-        <w:t xml:space="preserve">Table S2.</w:t>
-      </w:r>
-      <w:r>
-        <w:t xml:space="preserve"> </w:t>
-      </w:r>
-      <w:r>
-        <w:t xml:space="preserve">Annual percentage change (APC) of the MMR by federative unit, Prais-Winsten regression, Brazil, 2000–2023.</w:t>
-      </w:r>
-    </w:p>
-    <w:p>
-      <w:pPr>
-        <w:pStyle w:val="BodyText"/>
-      </w:pPr>
-      <w:r>
-        <w:rPr>
-          <w:bCs/>
-          <w:b/>
-        </w:rPr>
-        <w:t xml:space="preserve">Table S3.</w:t>
-      </w:r>
-      <w:r>
-        <w:t xml:space="preserve"> </w:t>
-      </w:r>
-      <w:r>
-        <w:t xml:space="preserve">Diagnostic tests for the interrupted time-series model.</w:t>
-      </w:r>
-    </w:p>
-    <w:p>
-      <w:pPr>
-        <w:pStyle w:val="BodyText"/>
-      </w:pPr>
-      <w:r>
-        <w:rPr>
-          <w:bCs/>
-          <w:b/>
-        </w:rPr>
-        <w:t xml:space="preserve">Figure S1.</w:t>
-      </w:r>
-      <w:r>
-        <w:t xml:space="preserve"> </w:t>
-      </w:r>
-      <w:r>
-        <w:t xml:space="preserve">Residual diagnostics for the interrupted time-series model.</w:t>
-      </w:r>
-    </w:p>
-    <w:p>
-      <w:pPr>
-        <w:pStyle w:val="BodyText"/>
-      </w:pPr>
-      <w:r>
-        <w:rPr>
-          <w:bCs/>
-          <w:b/>
-        </w:rPr>
-        <w:t xml:space="preserve">Figure S2.</w:t>
-      </w:r>
-      <w:r>
-        <w:t xml:space="preserve"> </w:t>
-      </w:r>
-      <w:r>
-        <w:t xml:space="preserve">Small multiples: MMR trends by federative unit, Brazil, 2000–2023.</w:t>
-      </w:r>
-    </w:p>
-    <w:bookmarkEnd w:id="48"/>
-    <w:bookmarkEnd w:id="49"/>
+        <w:t xml:space="preserve">Dashed red lines indicate the Rede Cegonha programme (2011); dashed blue lines indicate the COVID-19 pandemic onset (2020). Y-axes are free-scaled to highlight within-state variation.</w:t>
+      </w:r>
+    </w:p>
+    <w:bookmarkEnd w:id="65"/>
+    <w:bookmarkEnd w:id="66"/>
+    <w:bookmarkEnd w:id="67"/>
     <w:sectPr/>
   </w:body>
 </w:document>

</xml_diff>